<commit_message>
F2 layer things explanation
</commit_message>
<xml_diff>
--- a/review/reviewer_2.docx
+++ b/review/reviewer_2.docx
@@ -21,44 +21,35 @@
           <w:sz w:val="36"/>
           <w:szCs w:val="36"/>
         </w:rPr>
-        <w:t xml:space="preserve">Answers to the comments of reviewer </w:t>
-      </w:r>
-      <w:r>
+        <w:t>Answers to the comments of reviewer 2</w:t>
+      </w:r>
+    </w:p>
+    <w:p>
+      <w:pPr>
+        <w:pStyle w:val="Normal"/>
+        <w:bidi w:val="0"/>
+        <w:jc w:val="left"/>
+        <w:rPr/>
+      </w:pPr>
+      <w:r>
+        <w:rPr/>
+      </w:r>
+    </w:p>
+    <w:p>
+      <w:pPr>
+        <w:pStyle w:val="Normal"/>
+        <w:bidi w:val="0"/>
+        <w:jc w:val="left"/>
         <w:rPr>
           <w:b/>
           <w:bCs/>
-          <w:sz w:val="36"/>
-          <w:szCs w:val="36"/>
-        </w:rPr>
-        <w:t>2</w:t>
-      </w:r>
-    </w:p>
-    <w:p>
-      <w:pPr>
-        <w:pStyle w:val="Normal"/>
-        <w:bidi w:val="0"/>
-        <w:jc w:val="start"/>
-        <w:rPr/>
-      </w:pPr>
-      <w:r>
-        <w:rPr/>
-      </w:r>
-    </w:p>
-    <w:p>
-      <w:pPr>
-        <w:pStyle w:val="Normal"/>
-        <w:bidi w:val="0"/>
-        <w:jc w:val="start"/>
+        </w:rPr>
+      </w:pPr>
+      <w:r>
         <w:rPr>
           <w:b/>
           <w:bCs/>
         </w:rPr>
-      </w:pPr>
-      <w:r>
-        <w:rPr>
-          <w:b/>
-          <w:bCs/>
-        </w:rPr>
         <w:t>Introduction:</w:t>
       </w:r>
     </w:p>
@@ -66,18 +57,18 @@
       <w:pPr>
         <w:pStyle w:val="Normal"/>
         <w:bidi w:val="0"/>
-        <w:jc w:val="start"/>
-        <w:rPr/>
-      </w:pPr>
-      <w:r>
-        <w:rPr/>
-      </w:r>
-    </w:p>
-    <w:p>
-      <w:pPr>
-        <w:pStyle w:val="Normal"/>
-        <w:bidi w:val="0"/>
-        <w:jc w:val="start"/>
+        <w:jc w:val="left"/>
+        <w:rPr/>
+      </w:pPr>
+      <w:r>
+        <w:rPr/>
+      </w:r>
+    </w:p>
+    <w:p>
+      <w:pPr>
+        <w:pStyle w:val="Normal"/>
+        <w:bidi w:val="0"/>
+        <w:jc w:val="left"/>
         <w:rPr/>
       </w:pPr>
       <w:r>
@@ -89,7 +80,7 @@
       <w:pPr>
         <w:pStyle w:val="Normal"/>
         <w:bidi w:val="0"/>
-        <w:jc w:val="start"/>
+        <w:jc w:val="left"/>
         <w:rPr/>
       </w:pPr>
       <w:r>
@@ -104,7 +95,7 @@
           <w:numId w:val="1"/>
         </w:numPr>
         <w:bidi w:val="0"/>
-        <w:jc w:val="start"/>
+        <w:jc w:val="left"/>
         <w:rPr>
           <w:i/>
           <w:i/>
@@ -123,18 +114,18 @@
       <w:pPr>
         <w:pStyle w:val="Normal"/>
         <w:bidi w:val="0"/>
-        <w:jc w:val="start"/>
-        <w:rPr/>
-      </w:pPr>
-      <w:r>
-        <w:rPr/>
-      </w:r>
-    </w:p>
-    <w:p>
-      <w:pPr>
-        <w:pStyle w:val="Normal"/>
-        <w:bidi w:val="0"/>
-        <w:jc w:val="start"/>
+        <w:jc w:val="left"/>
+        <w:rPr/>
+      </w:pPr>
+      <w:r>
+        <w:rPr/>
+      </w:r>
+    </w:p>
+    <w:p>
+      <w:pPr>
+        <w:pStyle w:val="Normal"/>
+        <w:bidi w:val="0"/>
+        <w:jc w:val="left"/>
         <w:rPr/>
       </w:pPr>
       <w:r>
@@ -146,7 +137,7 @@
       <w:pPr>
         <w:pStyle w:val="Normal"/>
         <w:bidi w:val="0"/>
-        <w:jc w:val="start"/>
+        <w:jc w:val="left"/>
         <w:rPr/>
       </w:pPr>
       <w:r>
@@ -161,7 +152,7 @@
           <w:numId w:val="2"/>
         </w:numPr>
         <w:bidi w:val="0"/>
-        <w:jc w:val="start"/>
+        <w:jc w:val="left"/>
         <w:rPr>
           <w:i/>
           <w:i/>
@@ -180,18 +171,18 @@
       <w:pPr>
         <w:pStyle w:val="Normal"/>
         <w:bidi w:val="0"/>
-        <w:jc w:val="start"/>
-        <w:rPr/>
-      </w:pPr>
-      <w:r>
-        <w:rPr/>
-      </w:r>
-    </w:p>
-    <w:p>
-      <w:pPr>
-        <w:pStyle w:val="Normal"/>
-        <w:bidi w:val="0"/>
-        <w:jc w:val="start"/>
+        <w:jc w:val="left"/>
+        <w:rPr/>
+      </w:pPr>
+      <w:r>
+        <w:rPr/>
+      </w:r>
+    </w:p>
+    <w:p>
+      <w:pPr>
+        <w:pStyle w:val="Normal"/>
+        <w:bidi w:val="0"/>
+        <w:jc w:val="left"/>
         <w:rPr/>
       </w:pPr>
       <w:r>
@@ -203,7 +194,7 @@
       <w:pPr>
         <w:pStyle w:val="Normal"/>
         <w:bidi w:val="0"/>
-        <w:jc w:val="start"/>
+        <w:jc w:val="left"/>
         <w:rPr/>
       </w:pPr>
       <w:r>
@@ -218,7 +209,7 @@
           <w:numId w:val="3"/>
         </w:numPr>
         <w:bidi w:val="0"/>
-        <w:jc w:val="start"/>
+        <w:jc w:val="left"/>
         <w:rPr>
           <w:i/>
           <w:i/>
@@ -237,18 +228,18 @@
       <w:pPr>
         <w:pStyle w:val="Normal"/>
         <w:bidi w:val="0"/>
-        <w:jc w:val="start"/>
-        <w:rPr/>
-      </w:pPr>
-      <w:r>
-        <w:rPr/>
-      </w:r>
-    </w:p>
-    <w:p>
-      <w:pPr>
-        <w:pStyle w:val="Normal"/>
-        <w:bidi w:val="0"/>
-        <w:jc w:val="start"/>
+        <w:jc w:val="left"/>
+        <w:rPr/>
+      </w:pPr>
+      <w:r>
+        <w:rPr/>
+      </w:r>
+    </w:p>
+    <w:p>
+      <w:pPr>
+        <w:pStyle w:val="Normal"/>
+        <w:bidi w:val="0"/>
+        <w:jc w:val="left"/>
         <w:rPr/>
       </w:pPr>
       <w:r>
@@ -260,7 +251,7 @@
       <w:pPr>
         <w:pStyle w:val="Normal"/>
         <w:bidi w:val="0"/>
-        <w:jc w:val="start"/>
+        <w:jc w:val="left"/>
         <w:rPr/>
       </w:pPr>
       <w:r>
@@ -275,7 +266,7 @@
           <w:numId w:val="4"/>
         </w:numPr>
         <w:bidi w:val="0"/>
-        <w:jc w:val="start"/>
+        <w:jc w:val="left"/>
         <w:rPr>
           <w:i/>
           <w:i/>
@@ -294,18 +285,18 @@
       <w:pPr>
         <w:pStyle w:val="Normal"/>
         <w:bidi w:val="0"/>
-        <w:jc w:val="start"/>
-        <w:rPr/>
-      </w:pPr>
-      <w:r>
-        <w:rPr/>
-      </w:r>
-    </w:p>
-    <w:p>
-      <w:pPr>
-        <w:pStyle w:val="Normal"/>
-        <w:bidi w:val="0"/>
-        <w:jc w:val="start"/>
+        <w:jc w:val="left"/>
+        <w:rPr/>
+      </w:pPr>
+      <w:r>
+        <w:rPr/>
+      </w:r>
+    </w:p>
+    <w:p>
+      <w:pPr>
+        <w:pStyle w:val="Normal"/>
+        <w:bidi w:val="0"/>
+        <w:jc w:val="left"/>
         <w:rPr>
           <w:b/>
           <w:bCs/>
@@ -323,18 +314,18 @@
       <w:pPr>
         <w:pStyle w:val="Normal"/>
         <w:bidi w:val="0"/>
-        <w:jc w:val="start"/>
-        <w:rPr/>
-      </w:pPr>
-      <w:r>
-        <w:rPr/>
-      </w:r>
-    </w:p>
-    <w:p>
-      <w:pPr>
-        <w:pStyle w:val="Normal"/>
-        <w:bidi w:val="0"/>
-        <w:jc w:val="start"/>
+        <w:jc w:val="left"/>
+        <w:rPr/>
+      </w:pPr>
+      <w:r>
+        <w:rPr/>
+      </w:r>
+    </w:p>
+    <w:p>
+      <w:pPr>
+        <w:pStyle w:val="Normal"/>
+        <w:bidi w:val="0"/>
+        <w:jc w:val="left"/>
         <w:rPr/>
       </w:pPr>
       <w:r>
@@ -346,18 +337,18 @@
       <w:pPr>
         <w:pStyle w:val="Normal"/>
         <w:bidi w:val="0"/>
-        <w:jc w:val="start"/>
-        <w:rPr/>
-      </w:pPr>
-      <w:r>
-        <w:rPr/>
-      </w:r>
-    </w:p>
-    <w:p>
-      <w:pPr>
-        <w:pStyle w:val="Normal"/>
-        <w:bidi w:val="0"/>
-        <w:jc w:val="start"/>
+        <w:jc w:val="left"/>
+        <w:rPr/>
+      </w:pPr>
+      <w:r>
+        <w:rPr/>
+      </w:r>
+    </w:p>
+    <w:p>
+      <w:pPr>
+        <w:pStyle w:val="Normal"/>
+        <w:bidi w:val="0"/>
+        <w:jc w:val="left"/>
         <w:rPr/>
       </w:pPr>
       <w:r>
@@ -369,18 +360,59 @@
       <w:pPr>
         <w:pStyle w:val="Normal"/>
         <w:bidi w:val="0"/>
-        <w:jc w:val="start"/>
-        <w:rPr/>
-      </w:pPr>
-      <w:r>
-        <w:rPr/>
-      </w:r>
-    </w:p>
-    <w:p>
-      <w:pPr>
-        <w:pStyle w:val="Normal"/>
-        <w:bidi w:val="0"/>
-        <w:jc w:val="start"/>
+        <w:jc w:val="left"/>
+        <w:rPr>
+          <w:i w:val="false"/>
+          <w:i w:val="false"/>
+          <w:iCs w:val="false"/>
+        </w:rPr>
+      </w:pPr>
+      <w:r>
+        <w:rPr>
+          <w:i w:val="false"/>
+          <w:iCs w:val="false"/>
+        </w:rPr>
+      </w:r>
+    </w:p>
+    <w:p>
+      <w:pPr>
+        <w:pStyle w:val="Normal"/>
+        <w:numPr>
+          <w:ilvl w:val="0"/>
+          <w:numId w:val="12"/>
+        </w:numPr>
+        <w:bidi w:val="0"/>
+        <w:jc w:val="left"/>
+        <w:rPr>
+          <w:i/>
+          <w:i/>
+          <w:iCs/>
+        </w:rPr>
+      </w:pPr>
+      <w:r>
+        <w:rPr>
+          <w:i/>
+          <w:iCs/>
+        </w:rPr>
+        <w:t>A more clear explanation of F2 refraction / reflection and critical angle added.</w:t>
+      </w:r>
+    </w:p>
+    <w:p>
+      <w:pPr>
+        <w:pStyle w:val="Normal"/>
+        <w:bidi w:val="0"/>
+        <w:jc w:val="left"/>
+        <w:rPr/>
+      </w:pPr>
+      <w:r>
+        <w:rPr/>
+      </w:r>
+    </w:p>
+    <w:p>
+      <w:pPr>
+        <w:pStyle w:val="Normal"/>
+        <w:bidi w:val="0"/>
+        <w:jc w:val="left"/>
         <w:rPr/>
       </w:pPr>
       <w:r>
@@ -392,18 +424,18 @@
       <w:pPr>
         <w:pStyle w:val="Normal"/>
         <w:bidi w:val="0"/>
-        <w:jc w:val="start"/>
-        <w:rPr/>
-      </w:pPr>
-      <w:r>
-        <w:rPr/>
-      </w:r>
-    </w:p>
-    <w:p>
-      <w:pPr>
-        <w:pStyle w:val="Normal"/>
-        <w:bidi w:val="0"/>
-        <w:jc w:val="start"/>
+        <w:jc w:val="left"/>
+        <w:rPr/>
+      </w:pPr>
+      <w:r>
+        <w:rPr/>
+      </w:r>
+    </w:p>
+    <w:p>
+      <w:pPr>
+        <w:pStyle w:val="Normal"/>
+        <w:bidi w:val="0"/>
+        <w:jc w:val="left"/>
         <w:rPr>
           <w:b/>
           <w:bCs/>
@@ -421,18 +453,18 @@
       <w:pPr>
         <w:pStyle w:val="Normal"/>
         <w:bidi w:val="0"/>
-        <w:jc w:val="start"/>
-        <w:rPr/>
-      </w:pPr>
-      <w:r>
-        <w:rPr/>
-      </w:r>
-    </w:p>
-    <w:p>
-      <w:pPr>
-        <w:pStyle w:val="Normal"/>
-        <w:bidi w:val="0"/>
-        <w:jc w:val="start"/>
+        <w:jc w:val="left"/>
+        <w:rPr/>
+      </w:pPr>
+      <w:r>
+        <w:rPr/>
+      </w:r>
+    </w:p>
+    <w:p>
+      <w:pPr>
+        <w:pStyle w:val="Normal"/>
+        <w:bidi w:val="0"/>
+        <w:jc w:val="left"/>
         <w:rPr/>
       </w:pPr>
       <w:r>
@@ -444,7 +476,7 @@
       <w:pPr>
         <w:pStyle w:val="Normal"/>
         <w:bidi w:val="0"/>
-        <w:jc w:val="start"/>
+        <w:jc w:val="left"/>
         <w:rPr/>
       </w:pPr>
       <w:r>
@@ -459,7 +491,7 @@
           <w:numId w:val="5"/>
         </w:numPr>
         <w:bidi w:val="0"/>
-        <w:jc w:val="start"/>
+        <w:jc w:val="left"/>
         <w:rPr>
           <w:i/>
           <w:i/>
@@ -478,18 +510,18 @@
       <w:pPr>
         <w:pStyle w:val="Normal"/>
         <w:bidi w:val="0"/>
-        <w:jc w:val="start"/>
-        <w:rPr/>
-      </w:pPr>
-      <w:r>
-        <w:rPr/>
-      </w:r>
-    </w:p>
-    <w:p>
-      <w:pPr>
-        <w:pStyle w:val="Normal"/>
-        <w:bidi w:val="0"/>
-        <w:jc w:val="start"/>
+        <w:jc w:val="left"/>
+        <w:rPr/>
+      </w:pPr>
+      <w:r>
+        <w:rPr/>
+      </w:r>
+    </w:p>
+    <w:p>
+      <w:pPr>
+        <w:pStyle w:val="Normal"/>
+        <w:bidi w:val="0"/>
+        <w:jc w:val="left"/>
         <w:rPr/>
       </w:pPr>
       <w:r>
@@ -501,7 +533,7 @@
       <w:pPr>
         <w:pStyle w:val="Normal"/>
         <w:bidi w:val="0"/>
-        <w:jc w:val="start"/>
+        <w:jc w:val="left"/>
         <w:rPr/>
       </w:pPr>
       <w:r>
@@ -516,7 +548,7 @@
           <w:numId w:val="6"/>
         </w:numPr>
         <w:bidi w:val="0"/>
-        <w:jc w:val="start"/>
+        <w:jc w:val="left"/>
         <w:rPr>
           <w:i/>
           <w:i/>
@@ -535,18 +567,18 @@
       <w:pPr>
         <w:pStyle w:val="Normal"/>
         <w:bidi w:val="0"/>
-        <w:jc w:val="start"/>
-        <w:rPr/>
-      </w:pPr>
-      <w:r>
-        <w:rPr/>
-      </w:r>
-    </w:p>
-    <w:p>
-      <w:pPr>
-        <w:pStyle w:val="Normal"/>
-        <w:bidi w:val="0"/>
-        <w:jc w:val="start"/>
+        <w:jc w:val="left"/>
+        <w:rPr/>
+      </w:pPr>
+      <w:r>
+        <w:rPr/>
+      </w:r>
+    </w:p>
+    <w:p>
+      <w:pPr>
+        <w:pStyle w:val="Normal"/>
+        <w:bidi w:val="0"/>
+        <w:jc w:val="left"/>
         <w:rPr/>
       </w:pPr>
       <w:r>
@@ -558,7 +590,7 @@
       <w:pPr>
         <w:pStyle w:val="Normal"/>
         <w:bidi w:val="0"/>
-        <w:jc w:val="start"/>
+        <w:jc w:val="left"/>
         <w:rPr/>
       </w:pPr>
       <w:r>
@@ -573,7 +605,7 @@
           <w:numId w:val="7"/>
         </w:numPr>
         <w:bidi w:val="0"/>
-        <w:jc w:val="start"/>
+        <w:jc w:val="left"/>
         <w:rPr>
           <w:i/>
           <w:i/>
@@ -592,18 +624,18 @@
       <w:pPr>
         <w:pStyle w:val="Normal"/>
         <w:bidi w:val="0"/>
-        <w:jc w:val="start"/>
-        <w:rPr/>
-      </w:pPr>
-      <w:r>
-        <w:rPr/>
-      </w:r>
-    </w:p>
-    <w:p>
-      <w:pPr>
-        <w:pStyle w:val="Normal"/>
-        <w:bidi w:val="0"/>
-        <w:jc w:val="start"/>
+        <w:jc w:val="left"/>
+        <w:rPr/>
+      </w:pPr>
+      <w:r>
+        <w:rPr/>
+      </w:r>
+    </w:p>
+    <w:p>
+      <w:pPr>
+        <w:pStyle w:val="Normal"/>
+        <w:bidi w:val="0"/>
+        <w:jc w:val="left"/>
         <w:rPr/>
       </w:pPr>
       <w:r>
@@ -615,7 +647,7 @@
       <w:pPr>
         <w:pStyle w:val="Normal"/>
         <w:bidi w:val="0"/>
-        <w:jc w:val="start"/>
+        <w:jc w:val="left"/>
         <w:rPr/>
       </w:pPr>
       <w:r>
@@ -630,7 +662,7 @@
           <w:numId w:val="8"/>
         </w:numPr>
         <w:bidi w:val="0"/>
-        <w:jc w:val="start"/>
+        <w:jc w:val="left"/>
         <w:rPr>
           <w:i/>
           <w:i/>
@@ -649,18 +681,18 @@
       <w:pPr>
         <w:pStyle w:val="Normal"/>
         <w:bidi w:val="0"/>
-        <w:jc w:val="start"/>
-        <w:rPr/>
-      </w:pPr>
-      <w:r>
-        <w:rPr/>
-      </w:r>
-    </w:p>
-    <w:p>
-      <w:pPr>
-        <w:pStyle w:val="Normal"/>
-        <w:bidi w:val="0"/>
-        <w:jc w:val="start"/>
+        <w:jc w:val="left"/>
+        <w:rPr/>
+      </w:pPr>
+      <w:r>
+        <w:rPr/>
+      </w:r>
+    </w:p>
+    <w:p>
+      <w:pPr>
+        <w:pStyle w:val="Normal"/>
+        <w:bidi w:val="0"/>
+        <w:jc w:val="left"/>
         <w:rPr>
           <w:b/>
           <w:bCs/>
@@ -678,18 +710,18 @@
       <w:pPr>
         <w:pStyle w:val="Normal"/>
         <w:bidi w:val="0"/>
-        <w:jc w:val="start"/>
-        <w:rPr/>
-      </w:pPr>
-      <w:r>
-        <w:rPr/>
-      </w:r>
-    </w:p>
-    <w:p>
-      <w:pPr>
-        <w:pStyle w:val="Normal"/>
-        <w:bidi w:val="0"/>
-        <w:jc w:val="start"/>
+        <w:jc w:val="left"/>
+        <w:rPr/>
+      </w:pPr>
+      <w:r>
+        <w:rPr/>
+      </w:r>
+    </w:p>
+    <w:p>
+      <w:pPr>
+        <w:pStyle w:val="Normal"/>
+        <w:bidi w:val="0"/>
+        <w:jc w:val="left"/>
         <w:rPr/>
       </w:pPr>
       <w:r>
@@ -701,7 +733,7 @@
       <w:pPr>
         <w:pStyle w:val="Normal"/>
         <w:bidi w:val="0"/>
-        <w:jc w:val="start"/>
+        <w:jc w:val="left"/>
         <w:rPr/>
       </w:pPr>
       <w:r>
@@ -716,7 +748,7 @@
           <w:numId w:val="9"/>
         </w:numPr>
         <w:bidi w:val="0"/>
-        <w:jc w:val="start"/>
+        <w:jc w:val="left"/>
         <w:rPr>
           <w:i/>
           <w:i/>
@@ -735,18 +767,18 @@
       <w:pPr>
         <w:pStyle w:val="Normal"/>
         <w:bidi w:val="0"/>
-        <w:jc w:val="start"/>
-        <w:rPr/>
-      </w:pPr>
-      <w:r>
-        <w:rPr/>
-      </w:r>
-    </w:p>
-    <w:p>
-      <w:pPr>
-        <w:pStyle w:val="Normal"/>
-        <w:bidi w:val="0"/>
-        <w:jc w:val="start"/>
+        <w:jc w:val="left"/>
+        <w:rPr/>
+      </w:pPr>
+      <w:r>
+        <w:rPr/>
+      </w:r>
+    </w:p>
+    <w:p>
+      <w:pPr>
+        <w:pStyle w:val="Normal"/>
+        <w:bidi w:val="0"/>
+        <w:jc w:val="left"/>
         <w:rPr/>
       </w:pPr>
       <w:r>
@@ -758,18 +790,18 @@
       <w:pPr>
         <w:pStyle w:val="Normal"/>
         <w:bidi w:val="0"/>
-        <w:jc w:val="start"/>
-        <w:rPr/>
-      </w:pPr>
-      <w:r>
-        <w:rPr/>
-      </w:r>
-    </w:p>
-    <w:p>
-      <w:pPr>
-        <w:pStyle w:val="Normal"/>
-        <w:bidi w:val="0"/>
-        <w:jc w:val="start"/>
+        <w:jc w:val="left"/>
+        <w:rPr/>
+      </w:pPr>
+      <w:r>
+        <w:rPr/>
+      </w:r>
+    </w:p>
+    <w:p>
+      <w:pPr>
+        <w:pStyle w:val="Normal"/>
+        <w:bidi w:val="0"/>
+        <w:jc w:val="left"/>
         <w:rPr/>
       </w:pPr>
       <w:r>
@@ -781,18 +813,18 @@
       <w:pPr>
         <w:pStyle w:val="Normal"/>
         <w:bidi w:val="0"/>
-        <w:jc w:val="start"/>
-        <w:rPr/>
-      </w:pPr>
-      <w:r>
-        <w:rPr/>
-      </w:r>
-    </w:p>
-    <w:p>
-      <w:pPr>
-        <w:pStyle w:val="Normal"/>
-        <w:bidi w:val="0"/>
-        <w:jc w:val="start"/>
+        <w:jc w:val="left"/>
+        <w:rPr/>
+      </w:pPr>
+      <w:r>
+        <w:rPr/>
+      </w:r>
+    </w:p>
+    <w:p>
+      <w:pPr>
+        <w:pStyle w:val="Normal"/>
+        <w:bidi w:val="0"/>
+        <w:jc w:val="left"/>
         <w:rPr/>
       </w:pPr>
       <w:r>
@@ -804,18 +836,18 @@
       <w:pPr>
         <w:pStyle w:val="Normal"/>
         <w:bidi w:val="0"/>
-        <w:jc w:val="start"/>
-        <w:rPr/>
-      </w:pPr>
-      <w:r>
-        <w:rPr/>
-      </w:r>
-    </w:p>
-    <w:p>
-      <w:pPr>
-        <w:pStyle w:val="Normal"/>
-        <w:bidi w:val="0"/>
-        <w:jc w:val="start"/>
+        <w:jc w:val="left"/>
+        <w:rPr/>
+      </w:pPr>
+      <w:r>
+        <w:rPr/>
+      </w:r>
+    </w:p>
+    <w:p>
+      <w:pPr>
+        <w:pStyle w:val="Normal"/>
+        <w:bidi w:val="0"/>
+        <w:jc w:val="left"/>
         <w:rPr/>
       </w:pPr>
       <w:r>
@@ -827,7 +859,7 @@
       <w:pPr>
         <w:pStyle w:val="Normal"/>
         <w:bidi w:val="0"/>
-        <w:jc w:val="start"/>
+        <w:jc w:val="left"/>
         <w:rPr/>
       </w:pPr>
       <w:r>
@@ -842,7 +874,7 @@
           <w:numId w:val="10"/>
         </w:numPr>
         <w:bidi w:val="0"/>
-        <w:jc w:val="start"/>
+        <w:jc w:val="left"/>
         <w:rPr>
           <w:i/>
           <w:i/>
@@ -861,18 +893,18 @@
       <w:pPr>
         <w:pStyle w:val="Normal"/>
         <w:bidi w:val="0"/>
-        <w:jc w:val="start"/>
-        <w:rPr/>
-      </w:pPr>
-      <w:r>
-        <w:rPr/>
-      </w:r>
-    </w:p>
-    <w:p>
-      <w:pPr>
-        <w:pStyle w:val="Normal"/>
-        <w:bidi w:val="0"/>
-        <w:jc w:val="start"/>
+        <w:jc w:val="left"/>
+        <w:rPr/>
+      </w:pPr>
+      <w:r>
+        <w:rPr/>
+      </w:r>
+    </w:p>
+    <w:p>
+      <w:pPr>
+        <w:pStyle w:val="Normal"/>
+        <w:bidi w:val="0"/>
+        <w:jc w:val="left"/>
         <w:rPr>
           <w:b/>
           <w:bCs/>
@@ -890,18 +922,18 @@
       <w:pPr>
         <w:pStyle w:val="Normal"/>
         <w:bidi w:val="0"/>
-        <w:jc w:val="start"/>
-        <w:rPr/>
-      </w:pPr>
-      <w:r>
-        <w:rPr/>
-      </w:r>
-    </w:p>
-    <w:p>
-      <w:pPr>
-        <w:pStyle w:val="Normal"/>
-        <w:bidi w:val="0"/>
-        <w:jc w:val="start"/>
+        <w:jc w:val="left"/>
+        <w:rPr/>
+      </w:pPr>
+      <w:r>
+        <w:rPr/>
+      </w:r>
+    </w:p>
+    <w:p>
+      <w:pPr>
+        <w:pStyle w:val="Normal"/>
+        <w:bidi w:val="0"/>
+        <w:jc w:val="left"/>
         <w:rPr/>
       </w:pPr>
       <w:r>
@@ -913,7 +945,7 @@
       <w:pPr>
         <w:pStyle w:val="Normal"/>
         <w:bidi w:val="0"/>
-        <w:jc w:val="start"/>
+        <w:jc w:val="left"/>
         <w:rPr/>
       </w:pPr>
       <w:r>
@@ -928,7 +960,7 @@
           <w:numId w:val="11"/>
         </w:numPr>
         <w:bidi w:val="0"/>
-        <w:jc w:val="start"/>
+        <w:jc w:val="left"/>
         <w:rPr>
           <w:i/>
           <w:i/>
@@ -950,6 +982,7 @@
       <w:pgNumType w:fmt="decimal"/>
       <w:formProt w:val="false"/>
       <w:textDirection w:val="lrTb"/>
+      <w:docGrid w:type="default" w:linePitch="100" w:charSpace="0"/>
     </w:sectPr>
   </w:body>
 </w:document>
@@ -962,12 +995,12 @@
       <w:start w:val="1"/>
       <w:numFmt w:val="bullet"/>
       <w:lvlText w:val=""/>
-      <w:lvlJc w:val="start"/>
+      <w:lvlJc w:val="left"/>
       <w:pPr>
         <w:tabs>
           <w:tab w:val="num" w:pos="720"/>
         </w:tabs>
-        <w:ind w:start="720" w:hanging="360"/>
+        <w:ind w:left="720" w:hanging="360"/>
       </w:pPr>
       <w:rPr>
         <w:rFonts w:ascii="Symbol" w:hAnsi="Symbol" w:cs="Symbol" w:hint="default"/>
@@ -977,12 +1010,12 @@
       <w:start w:val="1"/>
       <w:numFmt w:val="bullet"/>
       <w:lvlText w:val="◦"/>
-      <w:lvlJc w:val="start"/>
+      <w:lvlJc w:val="left"/>
       <w:pPr>
         <w:tabs>
           <w:tab w:val="num" w:pos="1080"/>
         </w:tabs>
-        <w:ind w:start="1080" w:hanging="360"/>
+        <w:ind w:left="1080" w:hanging="360"/>
       </w:pPr>
       <w:rPr>
         <w:rFonts w:ascii="OpenSymbol" w:hAnsi="OpenSymbol" w:cs="OpenSymbol" w:hint="default"/>
@@ -992,12 +1025,12 @@
       <w:start w:val="1"/>
       <w:numFmt w:val="bullet"/>
       <w:lvlText w:val="▪"/>
-      <w:lvlJc w:val="start"/>
+      <w:lvlJc w:val="left"/>
       <w:pPr>
         <w:tabs>
           <w:tab w:val="num" w:pos="1440"/>
         </w:tabs>
-        <w:ind w:start="1440" w:hanging="360"/>
+        <w:ind w:left="1440" w:hanging="360"/>
       </w:pPr>
       <w:rPr>
         <w:rFonts w:ascii="OpenSymbol" w:hAnsi="OpenSymbol" w:cs="OpenSymbol" w:hint="default"/>
@@ -1007,12 +1040,12 @@
       <w:start w:val="1"/>
       <w:numFmt w:val="bullet"/>
       <w:lvlText w:val=""/>
-      <w:lvlJc w:val="start"/>
+      <w:lvlJc w:val="left"/>
       <w:pPr>
         <w:tabs>
           <w:tab w:val="num" w:pos="1800"/>
         </w:tabs>
-        <w:ind w:start="1800" w:hanging="360"/>
+        <w:ind w:left="1800" w:hanging="360"/>
       </w:pPr>
       <w:rPr>
         <w:rFonts w:ascii="Symbol" w:hAnsi="Symbol" w:cs="Symbol" w:hint="default"/>
@@ -1022,12 +1055,12 @@
       <w:start w:val="1"/>
       <w:numFmt w:val="bullet"/>
       <w:lvlText w:val="◦"/>
-      <w:lvlJc w:val="start"/>
+      <w:lvlJc w:val="left"/>
       <w:pPr>
         <w:tabs>
           <w:tab w:val="num" w:pos="2160"/>
         </w:tabs>
-        <w:ind w:start="2160" w:hanging="360"/>
+        <w:ind w:left="2160" w:hanging="360"/>
       </w:pPr>
       <w:rPr>
         <w:rFonts w:ascii="OpenSymbol" w:hAnsi="OpenSymbol" w:cs="OpenSymbol" w:hint="default"/>
@@ -1037,12 +1070,12 @@
       <w:start w:val="1"/>
       <w:numFmt w:val="bullet"/>
       <w:lvlText w:val="▪"/>
-      <w:lvlJc w:val="start"/>
+      <w:lvlJc w:val="left"/>
       <w:pPr>
         <w:tabs>
           <w:tab w:val="num" w:pos="2520"/>
         </w:tabs>
-        <w:ind w:start="2520" w:hanging="360"/>
+        <w:ind w:left="2520" w:hanging="360"/>
       </w:pPr>
       <w:rPr>
         <w:rFonts w:ascii="OpenSymbol" w:hAnsi="OpenSymbol" w:cs="OpenSymbol" w:hint="default"/>
@@ -1052,12 +1085,12 @@
       <w:start w:val="1"/>
       <w:numFmt w:val="bullet"/>
       <w:lvlText w:val=""/>
-      <w:lvlJc w:val="start"/>
+      <w:lvlJc w:val="left"/>
       <w:pPr>
         <w:tabs>
           <w:tab w:val="num" w:pos="2880"/>
         </w:tabs>
-        <w:ind w:start="2880" w:hanging="360"/>
+        <w:ind w:left="2880" w:hanging="360"/>
       </w:pPr>
       <w:rPr>
         <w:rFonts w:ascii="Symbol" w:hAnsi="Symbol" w:cs="Symbol" w:hint="default"/>
@@ -1067,12 +1100,12 @@
       <w:start w:val="1"/>
       <w:numFmt w:val="bullet"/>
       <w:lvlText w:val="◦"/>
-      <w:lvlJc w:val="start"/>
+      <w:lvlJc w:val="left"/>
       <w:pPr>
         <w:tabs>
           <w:tab w:val="num" w:pos="3240"/>
         </w:tabs>
-        <w:ind w:start="3240" w:hanging="360"/>
+        <w:ind w:left="3240" w:hanging="360"/>
       </w:pPr>
       <w:rPr>
         <w:rFonts w:ascii="OpenSymbol" w:hAnsi="OpenSymbol" w:cs="OpenSymbol" w:hint="default"/>
@@ -1082,12 +1115,12 @@
       <w:start w:val="1"/>
       <w:numFmt w:val="bullet"/>
       <w:lvlText w:val="▪"/>
-      <w:lvlJc w:val="start"/>
+      <w:lvlJc w:val="left"/>
       <w:pPr>
         <w:tabs>
           <w:tab w:val="num" w:pos="3600"/>
         </w:tabs>
-        <w:ind w:start="3600" w:hanging="360"/>
+        <w:ind w:left="3600" w:hanging="360"/>
       </w:pPr>
       <w:rPr>
         <w:rFonts w:ascii="OpenSymbol" w:hAnsi="OpenSymbol" w:cs="OpenSymbol" w:hint="default"/>
@@ -1099,12 +1132,12 @@
       <w:start w:val="1"/>
       <w:numFmt w:val="bullet"/>
       <w:lvlText w:val=""/>
-      <w:lvlJc w:val="start"/>
+      <w:lvlJc w:val="left"/>
       <w:pPr>
         <w:tabs>
           <w:tab w:val="num" w:pos="720"/>
         </w:tabs>
-        <w:ind w:start="720" w:hanging="360"/>
+        <w:ind w:left="720" w:hanging="360"/>
       </w:pPr>
       <w:rPr>
         <w:rFonts w:ascii="Symbol" w:hAnsi="Symbol" w:cs="Symbol" w:hint="default"/>
@@ -1114,12 +1147,12 @@
       <w:start w:val="1"/>
       <w:numFmt w:val="bullet"/>
       <w:lvlText w:val="◦"/>
-      <w:lvlJc w:val="start"/>
+      <w:lvlJc w:val="left"/>
       <w:pPr>
         <w:tabs>
           <w:tab w:val="num" w:pos="1080"/>
         </w:tabs>
-        <w:ind w:start="1080" w:hanging="360"/>
+        <w:ind w:left="1080" w:hanging="360"/>
       </w:pPr>
       <w:rPr>
         <w:rFonts w:ascii="OpenSymbol" w:hAnsi="OpenSymbol" w:cs="OpenSymbol" w:hint="default"/>
@@ -1129,12 +1162,12 @@
       <w:start w:val="1"/>
       <w:numFmt w:val="bullet"/>
       <w:lvlText w:val="▪"/>
-      <w:lvlJc w:val="start"/>
+      <w:lvlJc w:val="left"/>
       <w:pPr>
         <w:tabs>
           <w:tab w:val="num" w:pos="1440"/>
         </w:tabs>
-        <w:ind w:start="1440" w:hanging="360"/>
+        <w:ind w:left="1440" w:hanging="360"/>
       </w:pPr>
       <w:rPr>
         <w:rFonts w:ascii="OpenSymbol" w:hAnsi="OpenSymbol" w:cs="OpenSymbol" w:hint="default"/>
@@ -1144,12 +1177,12 @@
       <w:start w:val="1"/>
       <w:numFmt w:val="bullet"/>
       <w:lvlText w:val=""/>
-      <w:lvlJc w:val="start"/>
+      <w:lvlJc w:val="left"/>
       <w:pPr>
         <w:tabs>
           <w:tab w:val="num" w:pos="1800"/>
         </w:tabs>
-        <w:ind w:start="1800" w:hanging="360"/>
+        <w:ind w:left="1800" w:hanging="360"/>
       </w:pPr>
       <w:rPr>
         <w:rFonts w:ascii="Symbol" w:hAnsi="Symbol" w:cs="Symbol" w:hint="default"/>
@@ -1159,12 +1192,12 @@
       <w:start w:val="1"/>
       <w:numFmt w:val="bullet"/>
       <w:lvlText w:val="◦"/>
-      <w:lvlJc w:val="start"/>
+      <w:lvlJc w:val="left"/>
       <w:pPr>
         <w:tabs>
           <w:tab w:val="num" w:pos="2160"/>
         </w:tabs>
-        <w:ind w:start="2160" w:hanging="360"/>
+        <w:ind w:left="2160" w:hanging="360"/>
       </w:pPr>
       <w:rPr>
         <w:rFonts w:ascii="OpenSymbol" w:hAnsi="OpenSymbol" w:cs="OpenSymbol" w:hint="default"/>
@@ -1174,12 +1207,12 @@
       <w:start w:val="1"/>
       <w:numFmt w:val="bullet"/>
       <w:lvlText w:val="▪"/>
-      <w:lvlJc w:val="start"/>
+      <w:lvlJc w:val="left"/>
       <w:pPr>
         <w:tabs>
           <w:tab w:val="num" w:pos="2520"/>
         </w:tabs>
-        <w:ind w:start="2520" w:hanging="360"/>
+        <w:ind w:left="2520" w:hanging="360"/>
       </w:pPr>
       <w:rPr>
         <w:rFonts w:ascii="OpenSymbol" w:hAnsi="OpenSymbol" w:cs="OpenSymbol" w:hint="default"/>
@@ -1189,12 +1222,12 @@
       <w:start w:val="1"/>
       <w:numFmt w:val="bullet"/>
       <w:lvlText w:val=""/>
-      <w:lvlJc w:val="start"/>
+      <w:lvlJc w:val="left"/>
       <w:pPr>
         <w:tabs>
           <w:tab w:val="num" w:pos="2880"/>
         </w:tabs>
-        <w:ind w:start="2880" w:hanging="360"/>
+        <w:ind w:left="2880" w:hanging="360"/>
       </w:pPr>
       <w:rPr>
         <w:rFonts w:ascii="Symbol" w:hAnsi="Symbol" w:cs="Symbol" w:hint="default"/>
@@ -1204,12 +1237,12 @@
       <w:start w:val="1"/>
       <w:numFmt w:val="bullet"/>
       <w:lvlText w:val="◦"/>
-      <w:lvlJc w:val="start"/>
+      <w:lvlJc w:val="left"/>
       <w:pPr>
         <w:tabs>
           <w:tab w:val="num" w:pos="3240"/>
         </w:tabs>
-        <w:ind w:start="3240" w:hanging="360"/>
+        <w:ind w:left="3240" w:hanging="360"/>
       </w:pPr>
       <w:rPr>
         <w:rFonts w:ascii="OpenSymbol" w:hAnsi="OpenSymbol" w:cs="OpenSymbol" w:hint="default"/>
@@ -1219,12 +1252,12 @@
       <w:start w:val="1"/>
       <w:numFmt w:val="bullet"/>
       <w:lvlText w:val="▪"/>
-      <w:lvlJc w:val="start"/>
+      <w:lvlJc w:val="left"/>
       <w:pPr>
         <w:tabs>
           <w:tab w:val="num" w:pos="3600"/>
         </w:tabs>
-        <w:ind w:start="3600" w:hanging="360"/>
+        <w:ind w:left="3600" w:hanging="360"/>
       </w:pPr>
       <w:rPr>
         <w:rFonts w:ascii="OpenSymbol" w:hAnsi="OpenSymbol" w:cs="OpenSymbol" w:hint="default"/>
@@ -1236,12 +1269,12 @@
       <w:start w:val="1"/>
       <w:numFmt w:val="bullet"/>
       <w:lvlText w:val=""/>
-      <w:lvlJc w:val="start"/>
+      <w:lvlJc w:val="left"/>
       <w:pPr>
         <w:tabs>
           <w:tab w:val="num" w:pos="720"/>
         </w:tabs>
-        <w:ind w:start="720" w:hanging="360"/>
+        <w:ind w:left="720" w:hanging="360"/>
       </w:pPr>
       <w:rPr>
         <w:rFonts w:ascii="Symbol" w:hAnsi="Symbol" w:cs="Symbol" w:hint="default"/>
@@ -1251,12 +1284,12 @@
       <w:start w:val="1"/>
       <w:numFmt w:val="bullet"/>
       <w:lvlText w:val="◦"/>
-      <w:lvlJc w:val="start"/>
+      <w:lvlJc w:val="left"/>
       <w:pPr>
         <w:tabs>
           <w:tab w:val="num" w:pos="1080"/>
         </w:tabs>
-        <w:ind w:start="1080" w:hanging="360"/>
+        <w:ind w:left="1080" w:hanging="360"/>
       </w:pPr>
       <w:rPr>
         <w:rFonts w:ascii="OpenSymbol" w:hAnsi="OpenSymbol" w:cs="OpenSymbol" w:hint="default"/>
@@ -1266,12 +1299,12 @@
       <w:start w:val="1"/>
       <w:numFmt w:val="bullet"/>
       <w:lvlText w:val="▪"/>
-      <w:lvlJc w:val="start"/>
+      <w:lvlJc w:val="left"/>
       <w:pPr>
         <w:tabs>
           <w:tab w:val="num" w:pos="1440"/>
         </w:tabs>
-        <w:ind w:start="1440" w:hanging="360"/>
+        <w:ind w:left="1440" w:hanging="360"/>
       </w:pPr>
       <w:rPr>
         <w:rFonts w:ascii="OpenSymbol" w:hAnsi="OpenSymbol" w:cs="OpenSymbol" w:hint="default"/>
@@ -1281,12 +1314,12 @@
       <w:start w:val="1"/>
       <w:numFmt w:val="bullet"/>
       <w:lvlText w:val=""/>
-      <w:lvlJc w:val="start"/>
+      <w:lvlJc w:val="left"/>
       <w:pPr>
         <w:tabs>
           <w:tab w:val="num" w:pos="1800"/>
         </w:tabs>
-        <w:ind w:start="1800" w:hanging="360"/>
+        <w:ind w:left="1800" w:hanging="360"/>
       </w:pPr>
       <w:rPr>
         <w:rFonts w:ascii="Symbol" w:hAnsi="Symbol" w:cs="Symbol" w:hint="default"/>
@@ -1296,12 +1329,12 @@
       <w:start w:val="1"/>
       <w:numFmt w:val="bullet"/>
       <w:lvlText w:val="◦"/>
-      <w:lvlJc w:val="start"/>
+      <w:lvlJc w:val="left"/>
       <w:pPr>
         <w:tabs>
           <w:tab w:val="num" w:pos="2160"/>
         </w:tabs>
-        <w:ind w:start="2160" w:hanging="360"/>
+        <w:ind w:left="2160" w:hanging="360"/>
       </w:pPr>
       <w:rPr>
         <w:rFonts w:ascii="OpenSymbol" w:hAnsi="OpenSymbol" w:cs="OpenSymbol" w:hint="default"/>
@@ -1311,12 +1344,12 @@
       <w:start w:val="1"/>
       <w:numFmt w:val="bullet"/>
       <w:lvlText w:val="▪"/>
-      <w:lvlJc w:val="start"/>
+      <w:lvlJc w:val="left"/>
       <w:pPr>
         <w:tabs>
           <w:tab w:val="num" w:pos="2520"/>
         </w:tabs>
-        <w:ind w:start="2520" w:hanging="360"/>
+        <w:ind w:left="2520" w:hanging="360"/>
       </w:pPr>
       <w:rPr>
         <w:rFonts w:ascii="OpenSymbol" w:hAnsi="OpenSymbol" w:cs="OpenSymbol" w:hint="default"/>
@@ -1326,12 +1359,12 @@
       <w:start w:val="1"/>
       <w:numFmt w:val="bullet"/>
       <w:lvlText w:val=""/>
-      <w:lvlJc w:val="start"/>
+      <w:lvlJc w:val="left"/>
       <w:pPr>
         <w:tabs>
           <w:tab w:val="num" w:pos="2880"/>
         </w:tabs>
-        <w:ind w:start="2880" w:hanging="360"/>
+        <w:ind w:left="2880" w:hanging="360"/>
       </w:pPr>
       <w:rPr>
         <w:rFonts w:ascii="Symbol" w:hAnsi="Symbol" w:cs="Symbol" w:hint="default"/>
@@ -1341,12 +1374,12 @@
       <w:start w:val="1"/>
       <w:numFmt w:val="bullet"/>
       <w:lvlText w:val="◦"/>
-      <w:lvlJc w:val="start"/>
+      <w:lvlJc w:val="left"/>
       <w:pPr>
         <w:tabs>
           <w:tab w:val="num" w:pos="3240"/>
         </w:tabs>
-        <w:ind w:start="3240" w:hanging="360"/>
+        <w:ind w:left="3240" w:hanging="360"/>
       </w:pPr>
       <w:rPr>
         <w:rFonts w:ascii="OpenSymbol" w:hAnsi="OpenSymbol" w:cs="OpenSymbol" w:hint="default"/>
@@ -1356,12 +1389,12 @@
       <w:start w:val="1"/>
       <w:numFmt w:val="bullet"/>
       <w:lvlText w:val="▪"/>
-      <w:lvlJc w:val="start"/>
+      <w:lvlJc w:val="left"/>
       <w:pPr>
         <w:tabs>
           <w:tab w:val="num" w:pos="3600"/>
         </w:tabs>
-        <w:ind w:start="3600" w:hanging="360"/>
+        <w:ind w:left="3600" w:hanging="360"/>
       </w:pPr>
       <w:rPr>
         <w:rFonts w:ascii="OpenSymbol" w:hAnsi="OpenSymbol" w:cs="OpenSymbol" w:hint="default"/>
@@ -1373,27 +1406,31 @@
       <w:start w:val="1"/>
       <w:numFmt w:val="bullet"/>
       <w:lvlText w:val=""/>
-      <w:lvlJc w:val="start"/>
+      <w:lvlJc w:val="left"/>
       <w:pPr>
         <w:tabs>
           <w:tab w:val="num" w:pos="720"/>
         </w:tabs>
-        <w:ind w:start="720" w:hanging="360"/>
-      </w:pPr>
-      <w:rPr>
-        <w:rFonts w:ascii="Symbol" w:hAnsi="Symbol" w:cs="Symbol" w:hint="default"/>
+        <w:ind w:left="720" w:hanging="360"/>
+      </w:pPr>
+      <w:rPr>
+        <w:rFonts w:ascii="Symbol" w:hAnsi="Symbol" w:cs="Symbol" w:hint="default"/>
+        <w:i w:val="false"/>
+        <w:b w:val="false"/>
+        <w:iCs w:val="false"/>
+        <w:bCs w:val="false"/>
       </w:rPr>
     </w:lvl>
     <w:lvl w:ilvl="1">
       <w:start w:val="1"/>
       <w:numFmt w:val="bullet"/>
       <w:lvlText w:val="◦"/>
-      <w:lvlJc w:val="start"/>
+      <w:lvlJc w:val="left"/>
       <w:pPr>
         <w:tabs>
           <w:tab w:val="num" w:pos="1080"/>
         </w:tabs>
-        <w:ind w:start="1080" w:hanging="360"/>
+        <w:ind w:left="1080" w:hanging="360"/>
       </w:pPr>
       <w:rPr>
         <w:rFonts w:ascii="OpenSymbol" w:hAnsi="OpenSymbol" w:cs="OpenSymbol" w:hint="default"/>
@@ -1403,12 +1440,12 @@
       <w:start w:val="1"/>
       <w:numFmt w:val="bullet"/>
       <w:lvlText w:val="▪"/>
-      <w:lvlJc w:val="start"/>
+      <w:lvlJc w:val="left"/>
       <w:pPr>
         <w:tabs>
           <w:tab w:val="num" w:pos="1440"/>
         </w:tabs>
-        <w:ind w:start="1440" w:hanging="360"/>
+        <w:ind w:left="1440" w:hanging="360"/>
       </w:pPr>
       <w:rPr>
         <w:rFonts w:ascii="OpenSymbol" w:hAnsi="OpenSymbol" w:cs="OpenSymbol" w:hint="default"/>
@@ -1418,12 +1455,12 @@
       <w:start w:val="1"/>
       <w:numFmt w:val="bullet"/>
       <w:lvlText w:val=""/>
-      <w:lvlJc w:val="start"/>
+      <w:lvlJc w:val="left"/>
       <w:pPr>
         <w:tabs>
           <w:tab w:val="num" w:pos="1800"/>
         </w:tabs>
-        <w:ind w:start="1800" w:hanging="360"/>
+        <w:ind w:left="1800" w:hanging="360"/>
       </w:pPr>
       <w:rPr>
         <w:rFonts w:ascii="Symbol" w:hAnsi="Symbol" w:cs="Symbol" w:hint="default"/>
@@ -1433,12 +1470,12 @@
       <w:start w:val="1"/>
       <w:numFmt w:val="bullet"/>
       <w:lvlText w:val="◦"/>
-      <w:lvlJc w:val="start"/>
+      <w:lvlJc w:val="left"/>
       <w:pPr>
         <w:tabs>
           <w:tab w:val="num" w:pos="2160"/>
         </w:tabs>
-        <w:ind w:start="2160" w:hanging="360"/>
+        <w:ind w:left="2160" w:hanging="360"/>
       </w:pPr>
       <w:rPr>
         <w:rFonts w:ascii="OpenSymbol" w:hAnsi="OpenSymbol" w:cs="OpenSymbol" w:hint="default"/>
@@ -1448,12 +1485,12 @@
       <w:start w:val="1"/>
       <w:numFmt w:val="bullet"/>
       <w:lvlText w:val="▪"/>
-      <w:lvlJc w:val="start"/>
+      <w:lvlJc w:val="left"/>
       <w:pPr>
         <w:tabs>
           <w:tab w:val="num" w:pos="2520"/>
         </w:tabs>
-        <w:ind w:start="2520" w:hanging="360"/>
+        <w:ind w:left="2520" w:hanging="360"/>
       </w:pPr>
       <w:rPr>
         <w:rFonts w:ascii="OpenSymbol" w:hAnsi="OpenSymbol" w:cs="OpenSymbol" w:hint="default"/>
@@ -1463,12 +1500,12 @@
       <w:start w:val="1"/>
       <w:numFmt w:val="bullet"/>
       <w:lvlText w:val=""/>
-      <w:lvlJc w:val="start"/>
+      <w:lvlJc w:val="left"/>
       <w:pPr>
         <w:tabs>
           <w:tab w:val="num" w:pos="2880"/>
         </w:tabs>
-        <w:ind w:start="2880" w:hanging="360"/>
+        <w:ind w:left="2880" w:hanging="360"/>
       </w:pPr>
       <w:rPr>
         <w:rFonts w:ascii="Symbol" w:hAnsi="Symbol" w:cs="Symbol" w:hint="default"/>
@@ -1478,12 +1515,12 @@
       <w:start w:val="1"/>
       <w:numFmt w:val="bullet"/>
       <w:lvlText w:val="◦"/>
-      <w:lvlJc w:val="start"/>
+      <w:lvlJc w:val="left"/>
       <w:pPr>
         <w:tabs>
           <w:tab w:val="num" w:pos="3240"/>
         </w:tabs>
-        <w:ind w:start="3240" w:hanging="360"/>
+        <w:ind w:left="3240" w:hanging="360"/>
       </w:pPr>
       <w:rPr>
         <w:rFonts w:ascii="OpenSymbol" w:hAnsi="OpenSymbol" w:cs="OpenSymbol" w:hint="default"/>
@@ -1493,12 +1530,12 @@
       <w:start w:val="1"/>
       <w:numFmt w:val="bullet"/>
       <w:lvlText w:val="▪"/>
-      <w:lvlJc w:val="start"/>
+      <w:lvlJc w:val="left"/>
       <w:pPr>
         <w:tabs>
           <w:tab w:val="num" w:pos="3600"/>
         </w:tabs>
-        <w:ind w:start="3600" w:hanging="360"/>
+        <w:ind w:left="3600" w:hanging="360"/>
       </w:pPr>
       <w:rPr>
         <w:rFonts w:ascii="OpenSymbol" w:hAnsi="OpenSymbol" w:cs="OpenSymbol" w:hint="default"/>
@@ -1510,12 +1547,12 @@
       <w:start w:val="1"/>
       <w:numFmt w:val="bullet"/>
       <w:lvlText w:val=""/>
-      <w:lvlJc w:val="start"/>
+      <w:lvlJc w:val="left"/>
       <w:pPr>
         <w:tabs>
           <w:tab w:val="num" w:pos="720"/>
         </w:tabs>
-        <w:ind w:start="720" w:hanging="360"/>
+        <w:ind w:left="720" w:hanging="360"/>
       </w:pPr>
       <w:rPr>
         <w:rFonts w:ascii="Symbol" w:hAnsi="Symbol" w:cs="Symbol" w:hint="default"/>
@@ -1525,12 +1562,12 @@
       <w:start w:val="1"/>
       <w:numFmt w:val="bullet"/>
       <w:lvlText w:val="◦"/>
-      <w:lvlJc w:val="start"/>
+      <w:lvlJc w:val="left"/>
       <w:pPr>
         <w:tabs>
           <w:tab w:val="num" w:pos="1080"/>
         </w:tabs>
-        <w:ind w:start="1080" w:hanging="360"/>
+        <w:ind w:left="1080" w:hanging="360"/>
       </w:pPr>
       <w:rPr>
         <w:rFonts w:ascii="OpenSymbol" w:hAnsi="OpenSymbol" w:cs="OpenSymbol" w:hint="default"/>
@@ -1540,12 +1577,12 @@
       <w:start w:val="1"/>
       <w:numFmt w:val="bullet"/>
       <w:lvlText w:val="▪"/>
-      <w:lvlJc w:val="start"/>
+      <w:lvlJc w:val="left"/>
       <w:pPr>
         <w:tabs>
           <w:tab w:val="num" w:pos="1440"/>
         </w:tabs>
-        <w:ind w:start="1440" w:hanging="360"/>
+        <w:ind w:left="1440" w:hanging="360"/>
       </w:pPr>
       <w:rPr>
         <w:rFonts w:ascii="OpenSymbol" w:hAnsi="OpenSymbol" w:cs="OpenSymbol" w:hint="default"/>
@@ -1555,12 +1592,12 @@
       <w:start w:val="1"/>
       <w:numFmt w:val="bullet"/>
       <w:lvlText w:val=""/>
-      <w:lvlJc w:val="start"/>
+      <w:lvlJc w:val="left"/>
       <w:pPr>
         <w:tabs>
           <w:tab w:val="num" w:pos="1800"/>
         </w:tabs>
-        <w:ind w:start="1800" w:hanging="360"/>
+        <w:ind w:left="1800" w:hanging="360"/>
       </w:pPr>
       <w:rPr>
         <w:rFonts w:ascii="Symbol" w:hAnsi="Symbol" w:cs="Symbol" w:hint="default"/>
@@ -1570,12 +1607,12 @@
       <w:start w:val="1"/>
       <w:numFmt w:val="bullet"/>
       <w:lvlText w:val="◦"/>
-      <w:lvlJc w:val="start"/>
+      <w:lvlJc w:val="left"/>
       <w:pPr>
         <w:tabs>
           <w:tab w:val="num" w:pos="2160"/>
         </w:tabs>
-        <w:ind w:start="2160" w:hanging="360"/>
+        <w:ind w:left="2160" w:hanging="360"/>
       </w:pPr>
       <w:rPr>
         <w:rFonts w:ascii="OpenSymbol" w:hAnsi="OpenSymbol" w:cs="OpenSymbol" w:hint="default"/>
@@ -1585,12 +1622,12 @@
       <w:start w:val="1"/>
       <w:numFmt w:val="bullet"/>
       <w:lvlText w:val="▪"/>
-      <w:lvlJc w:val="start"/>
+      <w:lvlJc w:val="left"/>
       <w:pPr>
         <w:tabs>
           <w:tab w:val="num" w:pos="2520"/>
         </w:tabs>
-        <w:ind w:start="2520" w:hanging="360"/>
+        <w:ind w:left="2520" w:hanging="360"/>
       </w:pPr>
       <w:rPr>
         <w:rFonts w:ascii="OpenSymbol" w:hAnsi="OpenSymbol" w:cs="OpenSymbol" w:hint="default"/>
@@ -1600,12 +1637,12 @@
       <w:start w:val="1"/>
       <w:numFmt w:val="bullet"/>
       <w:lvlText w:val=""/>
-      <w:lvlJc w:val="start"/>
+      <w:lvlJc w:val="left"/>
       <w:pPr>
         <w:tabs>
           <w:tab w:val="num" w:pos="2880"/>
         </w:tabs>
-        <w:ind w:start="2880" w:hanging="360"/>
+        <w:ind w:left="2880" w:hanging="360"/>
       </w:pPr>
       <w:rPr>
         <w:rFonts w:ascii="Symbol" w:hAnsi="Symbol" w:cs="Symbol" w:hint="default"/>
@@ -1615,12 +1652,12 @@
       <w:start w:val="1"/>
       <w:numFmt w:val="bullet"/>
       <w:lvlText w:val="◦"/>
-      <w:lvlJc w:val="start"/>
+      <w:lvlJc w:val="left"/>
       <w:pPr>
         <w:tabs>
           <w:tab w:val="num" w:pos="3240"/>
         </w:tabs>
-        <w:ind w:start="3240" w:hanging="360"/>
+        <w:ind w:left="3240" w:hanging="360"/>
       </w:pPr>
       <w:rPr>
         <w:rFonts w:ascii="OpenSymbol" w:hAnsi="OpenSymbol" w:cs="OpenSymbol" w:hint="default"/>
@@ -1630,12 +1667,12 @@
       <w:start w:val="1"/>
       <w:numFmt w:val="bullet"/>
       <w:lvlText w:val="▪"/>
-      <w:lvlJc w:val="start"/>
+      <w:lvlJc w:val="left"/>
       <w:pPr>
         <w:tabs>
           <w:tab w:val="num" w:pos="3600"/>
         </w:tabs>
-        <w:ind w:start="3600" w:hanging="360"/>
+        <w:ind w:left="3600" w:hanging="360"/>
       </w:pPr>
       <w:rPr>
         <w:rFonts w:ascii="OpenSymbol" w:hAnsi="OpenSymbol" w:cs="OpenSymbol" w:hint="default"/>
@@ -1647,12 +1684,12 @@
       <w:start w:val="1"/>
       <w:numFmt w:val="bullet"/>
       <w:lvlText w:val=""/>
-      <w:lvlJc w:val="start"/>
+      <w:lvlJc w:val="left"/>
       <w:pPr>
         <w:tabs>
           <w:tab w:val="num" w:pos="720"/>
         </w:tabs>
-        <w:ind w:start="720" w:hanging="360"/>
+        <w:ind w:left="720" w:hanging="360"/>
       </w:pPr>
       <w:rPr>
         <w:rFonts w:ascii="Symbol" w:hAnsi="Symbol" w:cs="Symbol" w:hint="default"/>
@@ -1662,12 +1699,12 @@
       <w:start w:val="1"/>
       <w:numFmt w:val="bullet"/>
       <w:lvlText w:val="◦"/>
-      <w:lvlJc w:val="start"/>
+      <w:lvlJc w:val="left"/>
       <w:pPr>
         <w:tabs>
           <w:tab w:val="num" w:pos="1080"/>
         </w:tabs>
-        <w:ind w:start="1080" w:hanging="360"/>
+        <w:ind w:left="1080" w:hanging="360"/>
       </w:pPr>
       <w:rPr>
         <w:rFonts w:ascii="OpenSymbol" w:hAnsi="OpenSymbol" w:cs="OpenSymbol" w:hint="default"/>
@@ -1677,12 +1714,12 @@
       <w:start w:val="1"/>
       <w:numFmt w:val="bullet"/>
       <w:lvlText w:val="▪"/>
-      <w:lvlJc w:val="start"/>
+      <w:lvlJc w:val="left"/>
       <w:pPr>
         <w:tabs>
           <w:tab w:val="num" w:pos="1440"/>
         </w:tabs>
-        <w:ind w:start="1440" w:hanging="360"/>
+        <w:ind w:left="1440" w:hanging="360"/>
       </w:pPr>
       <w:rPr>
         <w:rFonts w:ascii="OpenSymbol" w:hAnsi="OpenSymbol" w:cs="OpenSymbol" w:hint="default"/>
@@ -1692,12 +1729,12 @@
       <w:start w:val="1"/>
       <w:numFmt w:val="bullet"/>
       <w:lvlText w:val=""/>
-      <w:lvlJc w:val="start"/>
+      <w:lvlJc w:val="left"/>
       <w:pPr>
         <w:tabs>
           <w:tab w:val="num" w:pos="1800"/>
         </w:tabs>
-        <w:ind w:start="1800" w:hanging="360"/>
+        <w:ind w:left="1800" w:hanging="360"/>
       </w:pPr>
       <w:rPr>
         <w:rFonts w:ascii="Symbol" w:hAnsi="Symbol" w:cs="Symbol" w:hint="default"/>
@@ -1707,12 +1744,12 @@
       <w:start w:val="1"/>
       <w:numFmt w:val="bullet"/>
       <w:lvlText w:val="◦"/>
-      <w:lvlJc w:val="start"/>
+      <w:lvlJc w:val="left"/>
       <w:pPr>
         <w:tabs>
           <w:tab w:val="num" w:pos="2160"/>
         </w:tabs>
-        <w:ind w:start="2160" w:hanging="360"/>
+        <w:ind w:left="2160" w:hanging="360"/>
       </w:pPr>
       <w:rPr>
         <w:rFonts w:ascii="OpenSymbol" w:hAnsi="OpenSymbol" w:cs="OpenSymbol" w:hint="default"/>
@@ -1722,12 +1759,12 @@
       <w:start w:val="1"/>
       <w:numFmt w:val="bullet"/>
       <w:lvlText w:val="▪"/>
-      <w:lvlJc w:val="start"/>
+      <w:lvlJc w:val="left"/>
       <w:pPr>
         <w:tabs>
           <w:tab w:val="num" w:pos="2520"/>
         </w:tabs>
-        <w:ind w:start="2520" w:hanging="360"/>
+        <w:ind w:left="2520" w:hanging="360"/>
       </w:pPr>
       <w:rPr>
         <w:rFonts w:ascii="OpenSymbol" w:hAnsi="OpenSymbol" w:cs="OpenSymbol" w:hint="default"/>
@@ -1737,12 +1774,12 @@
       <w:start w:val="1"/>
       <w:numFmt w:val="bullet"/>
       <w:lvlText w:val=""/>
-      <w:lvlJc w:val="start"/>
+      <w:lvlJc w:val="left"/>
       <w:pPr>
         <w:tabs>
           <w:tab w:val="num" w:pos="2880"/>
         </w:tabs>
-        <w:ind w:start="2880" w:hanging="360"/>
+        <w:ind w:left="2880" w:hanging="360"/>
       </w:pPr>
       <w:rPr>
         <w:rFonts w:ascii="Symbol" w:hAnsi="Symbol" w:cs="Symbol" w:hint="default"/>
@@ -1752,12 +1789,12 @@
       <w:start w:val="1"/>
       <w:numFmt w:val="bullet"/>
       <w:lvlText w:val="◦"/>
-      <w:lvlJc w:val="start"/>
+      <w:lvlJc w:val="left"/>
       <w:pPr>
         <w:tabs>
           <w:tab w:val="num" w:pos="3240"/>
         </w:tabs>
-        <w:ind w:start="3240" w:hanging="360"/>
+        <w:ind w:left="3240" w:hanging="360"/>
       </w:pPr>
       <w:rPr>
         <w:rFonts w:ascii="OpenSymbol" w:hAnsi="OpenSymbol" w:cs="OpenSymbol" w:hint="default"/>
@@ -1767,12 +1804,12 @@
       <w:start w:val="1"/>
       <w:numFmt w:val="bullet"/>
       <w:lvlText w:val="▪"/>
-      <w:lvlJc w:val="start"/>
+      <w:lvlJc w:val="left"/>
       <w:pPr>
         <w:tabs>
           <w:tab w:val="num" w:pos="3600"/>
         </w:tabs>
-        <w:ind w:start="3600" w:hanging="360"/>
+        <w:ind w:left="3600" w:hanging="360"/>
       </w:pPr>
       <w:rPr>
         <w:rFonts w:ascii="OpenSymbol" w:hAnsi="OpenSymbol" w:cs="OpenSymbol" w:hint="default"/>
@@ -1784,12 +1821,12 @@
       <w:start w:val="1"/>
       <w:numFmt w:val="bullet"/>
       <w:lvlText w:val=""/>
-      <w:lvlJc w:val="start"/>
+      <w:lvlJc w:val="left"/>
       <w:pPr>
         <w:tabs>
           <w:tab w:val="num" w:pos="720"/>
         </w:tabs>
-        <w:ind w:start="720" w:hanging="360"/>
+        <w:ind w:left="720" w:hanging="360"/>
       </w:pPr>
       <w:rPr>
         <w:rFonts w:ascii="Symbol" w:hAnsi="Symbol" w:cs="Symbol" w:hint="default"/>
@@ -1799,12 +1836,12 @@
       <w:start w:val="1"/>
       <w:numFmt w:val="bullet"/>
       <w:lvlText w:val="◦"/>
-      <w:lvlJc w:val="start"/>
+      <w:lvlJc w:val="left"/>
       <w:pPr>
         <w:tabs>
           <w:tab w:val="num" w:pos="1080"/>
         </w:tabs>
-        <w:ind w:start="1080" w:hanging="360"/>
+        <w:ind w:left="1080" w:hanging="360"/>
       </w:pPr>
       <w:rPr>
         <w:rFonts w:ascii="OpenSymbol" w:hAnsi="OpenSymbol" w:cs="OpenSymbol" w:hint="default"/>
@@ -1814,12 +1851,12 @@
       <w:start w:val="1"/>
       <w:numFmt w:val="bullet"/>
       <w:lvlText w:val="▪"/>
-      <w:lvlJc w:val="start"/>
+      <w:lvlJc w:val="left"/>
       <w:pPr>
         <w:tabs>
           <w:tab w:val="num" w:pos="1440"/>
         </w:tabs>
-        <w:ind w:start="1440" w:hanging="360"/>
+        <w:ind w:left="1440" w:hanging="360"/>
       </w:pPr>
       <w:rPr>
         <w:rFonts w:ascii="OpenSymbol" w:hAnsi="OpenSymbol" w:cs="OpenSymbol" w:hint="default"/>
@@ -1829,12 +1866,12 @@
       <w:start w:val="1"/>
       <w:numFmt w:val="bullet"/>
       <w:lvlText w:val=""/>
-      <w:lvlJc w:val="start"/>
+      <w:lvlJc w:val="left"/>
       <w:pPr>
         <w:tabs>
           <w:tab w:val="num" w:pos="1800"/>
         </w:tabs>
-        <w:ind w:start="1800" w:hanging="360"/>
+        <w:ind w:left="1800" w:hanging="360"/>
       </w:pPr>
       <w:rPr>
         <w:rFonts w:ascii="Symbol" w:hAnsi="Symbol" w:cs="Symbol" w:hint="default"/>
@@ -1844,12 +1881,12 @@
       <w:start w:val="1"/>
       <w:numFmt w:val="bullet"/>
       <w:lvlText w:val="◦"/>
-      <w:lvlJc w:val="start"/>
+      <w:lvlJc w:val="left"/>
       <w:pPr>
         <w:tabs>
           <w:tab w:val="num" w:pos="2160"/>
         </w:tabs>
-        <w:ind w:start="2160" w:hanging="360"/>
+        <w:ind w:left="2160" w:hanging="360"/>
       </w:pPr>
       <w:rPr>
         <w:rFonts w:ascii="OpenSymbol" w:hAnsi="OpenSymbol" w:cs="OpenSymbol" w:hint="default"/>
@@ -1859,12 +1896,12 @@
       <w:start w:val="1"/>
       <w:numFmt w:val="bullet"/>
       <w:lvlText w:val="▪"/>
-      <w:lvlJc w:val="start"/>
+      <w:lvlJc w:val="left"/>
       <w:pPr>
         <w:tabs>
           <w:tab w:val="num" w:pos="2520"/>
         </w:tabs>
-        <w:ind w:start="2520" w:hanging="360"/>
+        <w:ind w:left="2520" w:hanging="360"/>
       </w:pPr>
       <w:rPr>
         <w:rFonts w:ascii="OpenSymbol" w:hAnsi="OpenSymbol" w:cs="OpenSymbol" w:hint="default"/>
@@ -1874,12 +1911,12 @@
       <w:start w:val="1"/>
       <w:numFmt w:val="bullet"/>
       <w:lvlText w:val=""/>
-      <w:lvlJc w:val="start"/>
+      <w:lvlJc w:val="left"/>
       <w:pPr>
         <w:tabs>
           <w:tab w:val="num" w:pos="2880"/>
         </w:tabs>
-        <w:ind w:start="2880" w:hanging="360"/>
+        <w:ind w:left="2880" w:hanging="360"/>
       </w:pPr>
       <w:rPr>
         <w:rFonts w:ascii="Symbol" w:hAnsi="Symbol" w:cs="Symbol" w:hint="default"/>
@@ -1889,12 +1926,12 @@
       <w:start w:val="1"/>
       <w:numFmt w:val="bullet"/>
       <w:lvlText w:val="◦"/>
-      <w:lvlJc w:val="start"/>
+      <w:lvlJc w:val="left"/>
       <w:pPr>
         <w:tabs>
           <w:tab w:val="num" w:pos="3240"/>
         </w:tabs>
-        <w:ind w:start="3240" w:hanging="360"/>
+        <w:ind w:left="3240" w:hanging="360"/>
       </w:pPr>
       <w:rPr>
         <w:rFonts w:ascii="OpenSymbol" w:hAnsi="OpenSymbol" w:cs="OpenSymbol" w:hint="default"/>
@@ -1904,12 +1941,12 @@
       <w:start w:val="1"/>
       <w:numFmt w:val="bullet"/>
       <w:lvlText w:val="▪"/>
-      <w:lvlJc w:val="start"/>
+      <w:lvlJc w:val="left"/>
       <w:pPr>
         <w:tabs>
           <w:tab w:val="num" w:pos="3600"/>
         </w:tabs>
-        <w:ind w:start="3600" w:hanging="360"/>
+        <w:ind w:left="3600" w:hanging="360"/>
       </w:pPr>
       <w:rPr>
         <w:rFonts w:ascii="OpenSymbol" w:hAnsi="OpenSymbol" w:cs="OpenSymbol" w:hint="default"/>
@@ -1921,12 +1958,12 @@
       <w:start w:val="1"/>
       <w:numFmt w:val="bullet"/>
       <w:lvlText w:val=""/>
-      <w:lvlJc w:val="start"/>
+      <w:lvlJc w:val="left"/>
       <w:pPr>
         <w:tabs>
           <w:tab w:val="num" w:pos="720"/>
         </w:tabs>
-        <w:ind w:start="720" w:hanging="360"/>
+        <w:ind w:left="720" w:hanging="360"/>
       </w:pPr>
       <w:rPr>
         <w:rFonts w:ascii="Symbol" w:hAnsi="Symbol" w:cs="Symbol" w:hint="default"/>
@@ -1936,12 +1973,12 @@
       <w:start w:val="1"/>
       <w:numFmt w:val="bullet"/>
       <w:lvlText w:val="◦"/>
-      <w:lvlJc w:val="start"/>
+      <w:lvlJc w:val="left"/>
       <w:pPr>
         <w:tabs>
           <w:tab w:val="num" w:pos="1080"/>
         </w:tabs>
-        <w:ind w:start="1080" w:hanging="360"/>
+        <w:ind w:left="1080" w:hanging="360"/>
       </w:pPr>
       <w:rPr>
         <w:rFonts w:ascii="OpenSymbol" w:hAnsi="OpenSymbol" w:cs="OpenSymbol" w:hint="default"/>
@@ -1951,12 +1988,12 @@
       <w:start w:val="1"/>
       <w:numFmt w:val="bullet"/>
       <w:lvlText w:val="▪"/>
-      <w:lvlJc w:val="start"/>
+      <w:lvlJc w:val="left"/>
       <w:pPr>
         <w:tabs>
           <w:tab w:val="num" w:pos="1440"/>
         </w:tabs>
-        <w:ind w:start="1440" w:hanging="360"/>
+        <w:ind w:left="1440" w:hanging="360"/>
       </w:pPr>
       <w:rPr>
         <w:rFonts w:ascii="OpenSymbol" w:hAnsi="OpenSymbol" w:cs="OpenSymbol" w:hint="default"/>
@@ -1966,12 +2003,12 @@
       <w:start w:val="1"/>
       <w:numFmt w:val="bullet"/>
       <w:lvlText w:val=""/>
-      <w:lvlJc w:val="start"/>
+      <w:lvlJc w:val="left"/>
       <w:pPr>
         <w:tabs>
           <w:tab w:val="num" w:pos="1800"/>
         </w:tabs>
-        <w:ind w:start="1800" w:hanging="360"/>
+        <w:ind w:left="1800" w:hanging="360"/>
       </w:pPr>
       <w:rPr>
         <w:rFonts w:ascii="Symbol" w:hAnsi="Symbol" w:cs="Symbol" w:hint="default"/>
@@ -1981,12 +2018,12 @@
       <w:start w:val="1"/>
       <w:numFmt w:val="bullet"/>
       <w:lvlText w:val="◦"/>
-      <w:lvlJc w:val="start"/>
+      <w:lvlJc w:val="left"/>
       <w:pPr>
         <w:tabs>
           <w:tab w:val="num" w:pos="2160"/>
         </w:tabs>
-        <w:ind w:start="2160" w:hanging="360"/>
+        <w:ind w:left="2160" w:hanging="360"/>
       </w:pPr>
       <w:rPr>
         <w:rFonts w:ascii="OpenSymbol" w:hAnsi="OpenSymbol" w:cs="OpenSymbol" w:hint="default"/>
@@ -1996,12 +2033,12 @@
       <w:start w:val="1"/>
       <w:numFmt w:val="bullet"/>
       <w:lvlText w:val="▪"/>
-      <w:lvlJc w:val="start"/>
+      <w:lvlJc w:val="left"/>
       <w:pPr>
         <w:tabs>
           <w:tab w:val="num" w:pos="2520"/>
         </w:tabs>
-        <w:ind w:start="2520" w:hanging="360"/>
+        <w:ind w:left="2520" w:hanging="360"/>
       </w:pPr>
       <w:rPr>
         <w:rFonts w:ascii="OpenSymbol" w:hAnsi="OpenSymbol" w:cs="OpenSymbol" w:hint="default"/>
@@ -2011,12 +2048,12 @@
       <w:start w:val="1"/>
       <w:numFmt w:val="bullet"/>
       <w:lvlText w:val=""/>
-      <w:lvlJc w:val="start"/>
+      <w:lvlJc w:val="left"/>
       <w:pPr>
         <w:tabs>
           <w:tab w:val="num" w:pos="2880"/>
         </w:tabs>
-        <w:ind w:start="2880" w:hanging="360"/>
+        <w:ind w:left="2880" w:hanging="360"/>
       </w:pPr>
       <w:rPr>
         <w:rFonts w:ascii="Symbol" w:hAnsi="Symbol" w:cs="Symbol" w:hint="default"/>
@@ -2026,12 +2063,12 @@
       <w:start w:val="1"/>
       <w:numFmt w:val="bullet"/>
       <w:lvlText w:val="◦"/>
-      <w:lvlJc w:val="start"/>
+      <w:lvlJc w:val="left"/>
       <w:pPr>
         <w:tabs>
           <w:tab w:val="num" w:pos="3240"/>
         </w:tabs>
-        <w:ind w:start="3240" w:hanging="360"/>
+        <w:ind w:left="3240" w:hanging="360"/>
       </w:pPr>
       <w:rPr>
         <w:rFonts w:ascii="OpenSymbol" w:hAnsi="OpenSymbol" w:cs="OpenSymbol" w:hint="default"/>
@@ -2041,12 +2078,12 @@
       <w:start w:val="1"/>
       <w:numFmt w:val="bullet"/>
       <w:lvlText w:val="▪"/>
-      <w:lvlJc w:val="start"/>
+      <w:lvlJc w:val="left"/>
       <w:pPr>
         <w:tabs>
           <w:tab w:val="num" w:pos="3600"/>
         </w:tabs>
-        <w:ind w:start="3600" w:hanging="360"/>
+        <w:ind w:left="3600" w:hanging="360"/>
       </w:pPr>
       <w:rPr>
         <w:rFonts w:ascii="OpenSymbol" w:hAnsi="OpenSymbol" w:cs="OpenSymbol" w:hint="default"/>
@@ -2058,12 +2095,12 @@
       <w:start w:val="1"/>
       <w:numFmt w:val="bullet"/>
       <w:lvlText w:val=""/>
-      <w:lvlJc w:val="start"/>
+      <w:lvlJc w:val="left"/>
       <w:pPr>
         <w:tabs>
           <w:tab w:val="num" w:pos="720"/>
         </w:tabs>
-        <w:ind w:start="720" w:hanging="360"/>
+        <w:ind w:left="720" w:hanging="360"/>
       </w:pPr>
       <w:rPr>
         <w:rFonts w:ascii="Symbol" w:hAnsi="Symbol" w:cs="Symbol" w:hint="default"/>
@@ -2073,12 +2110,12 @@
       <w:start w:val="1"/>
       <w:numFmt w:val="bullet"/>
       <w:lvlText w:val="◦"/>
-      <w:lvlJc w:val="start"/>
+      <w:lvlJc w:val="left"/>
       <w:pPr>
         <w:tabs>
           <w:tab w:val="num" w:pos="1080"/>
         </w:tabs>
-        <w:ind w:start="1080" w:hanging="360"/>
+        <w:ind w:left="1080" w:hanging="360"/>
       </w:pPr>
       <w:rPr>
         <w:rFonts w:ascii="OpenSymbol" w:hAnsi="OpenSymbol" w:cs="OpenSymbol" w:hint="default"/>
@@ -2088,12 +2125,12 @@
       <w:start w:val="1"/>
       <w:numFmt w:val="bullet"/>
       <w:lvlText w:val="▪"/>
-      <w:lvlJc w:val="start"/>
+      <w:lvlJc w:val="left"/>
       <w:pPr>
         <w:tabs>
           <w:tab w:val="num" w:pos="1440"/>
         </w:tabs>
-        <w:ind w:start="1440" w:hanging="360"/>
+        <w:ind w:left="1440" w:hanging="360"/>
       </w:pPr>
       <w:rPr>
         <w:rFonts w:ascii="OpenSymbol" w:hAnsi="OpenSymbol" w:cs="OpenSymbol" w:hint="default"/>
@@ -2103,12 +2140,12 @@
       <w:start w:val="1"/>
       <w:numFmt w:val="bullet"/>
       <w:lvlText w:val=""/>
-      <w:lvlJc w:val="start"/>
+      <w:lvlJc w:val="left"/>
       <w:pPr>
         <w:tabs>
           <w:tab w:val="num" w:pos="1800"/>
         </w:tabs>
-        <w:ind w:start="1800" w:hanging="360"/>
+        <w:ind w:left="1800" w:hanging="360"/>
       </w:pPr>
       <w:rPr>
         <w:rFonts w:ascii="Symbol" w:hAnsi="Symbol" w:cs="Symbol" w:hint="default"/>
@@ -2118,12 +2155,12 @@
       <w:start w:val="1"/>
       <w:numFmt w:val="bullet"/>
       <w:lvlText w:val="◦"/>
-      <w:lvlJc w:val="start"/>
+      <w:lvlJc w:val="left"/>
       <w:pPr>
         <w:tabs>
           <w:tab w:val="num" w:pos="2160"/>
         </w:tabs>
-        <w:ind w:start="2160" w:hanging="360"/>
+        <w:ind w:left="2160" w:hanging="360"/>
       </w:pPr>
       <w:rPr>
         <w:rFonts w:ascii="OpenSymbol" w:hAnsi="OpenSymbol" w:cs="OpenSymbol" w:hint="default"/>
@@ -2133,12 +2170,12 @@
       <w:start w:val="1"/>
       <w:numFmt w:val="bullet"/>
       <w:lvlText w:val="▪"/>
-      <w:lvlJc w:val="start"/>
+      <w:lvlJc w:val="left"/>
       <w:pPr>
         <w:tabs>
           <w:tab w:val="num" w:pos="2520"/>
         </w:tabs>
-        <w:ind w:start="2520" w:hanging="360"/>
+        <w:ind w:left="2520" w:hanging="360"/>
       </w:pPr>
       <w:rPr>
         <w:rFonts w:ascii="OpenSymbol" w:hAnsi="OpenSymbol" w:cs="OpenSymbol" w:hint="default"/>
@@ -2148,12 +2185,12 @@
       <w:start w:val="1"/>
       <w:numFmt w:val="bullet"/>
       <w:lvlText w:val=""/>
-      <w:lvlJc w:val="start"/>
+      <w:lvlJc w:val="left"/>
       <w:pPr>
         <w:tabs>
           <w:tab w:val="num" w:pos="2880"/>
         </w:tabs>
-        <w:ind w:start="2880" w:hanging="360"/>
+        <w:ind w:left="2880" w:hanging="360"/>
       </w:pPr>
       <w:rPr>
         <w:rFonts w:ascii="Symbol" w:hAnsi="Symbol" w:cs="Symbol" w:hint="default"/>
@@ -2163,12 +2200,12 @@
       <w:start w:val="1"/>
       <w:numFmt w:val="bullet"/>
       <w:lvlText w:val="◦"/>
-      <w:lvlJc w:val="start"/>
+      <w:lvlJc w:val="left"/>
       <w:pPr>
         <w:tabs>
           <w:tab w:val="num" w:pos="3240"/>
         </w:tabs>
-        <w:ind w:start="3240" w:hanging="360"/>
+        <w:ind w:left="3240" w:hanging="360"/>
       </w:pPr>
       <w:rPr>
         <w:rFonts w:ascii="OpenSymbol" w:hAnsi="OpenSymbol" w:cs="OpenSymbol" w:hint="default"/>
@@ -2178,12 +2215,12 @@
       <w:start w:val="1"/>
       <w:numFmt w:val="bullet"/>
       <w:lvlText w:val="▪"/>
-      <w:lvlJc w:val="start"/>
+      <w:lvlJc w:val="left"/>
       <w:pPr>
         <w:tabs>
           <w:tab w:val="num" w:pos="3600"/>
         </w:tabs>
-        <w:ind w:start="3600" w:hanging="360"/>
+        <w:ind w:left="3600" w:hanging="360"/>
       </w:pPr>
       <w:rPr>
         <w:rFonts w:ascii="OpenSymbol" w:hAnsi="OpenSymbol" w:cs="OpenSymbol" w:hint="default"/>
@@ -2195,12 +2232,12 @@
       <w:start w:val="1"/>
       <w:numFmt w:val="bullet"/>
       <w:lvlText w:val=""/>
-      <w:lvlJc w:val="start"/>
+      <w:lvlJc w:val="left"/>
       <w:pPr>
         <w:tabs>
           <w:tab w:val="num" w:pos="720"/>
         </w:tabs>
-        <w:ind w:start="720" w:hanging="360"/>
+        <w:ind w:left="720" w:hanging="360"/>
       </w:pPr>
       <w:rPr>
         <w:rFonts w:ascii="Symbol" w:hAnsi="Symbol" w:cs="Symbol" w:hint="default"/>
@@ -2210,12 +2247,12 @@
       <w:start w:val="1"/>
       <w:numFmt w:val="bullet"/>
       <w:lvlText w:val="◦"/>
-      <w:lvlJc w:val="start"/>
+      <w:lvlJc w:val="left"/>
       <w:pPr>
         <w:tabs>
           <w:tab w:val="num" w:pos="1080"/>
         </w:tabs>
-        <w:ind w:start="1080" w:hanging="360"/>
+        <w:ind w:left="1080" w:hanging="360"/>
       </w:pPr>
       <w:rPr>
         <w:rFonts w:ascii="OpenSymbol" w:hAnsi="OpenSymbol" w:cs="OpenSymbol" w:hint="default"/>
@@ -2225,12 +2262,12 @@
       <w:start w:val="1"/>
       <w:numFmt w:val="bullet"/>
       <w:lvlText w:val="▪"/>
-      <w:lvlJc w:val="start"/>
+      <w:lvlJc w:val="left"/>
       <w:pPr>
         <w:tabs>
           <w:tab w:val="num" w:pos="1440"/>
         </w:tabs>
-        <w:ind w:start="1440" w:hanging="360"/>
+        <w:ind w:left="1440" w:hanging="360"/>
       </w:pPr>
       <w:rPr>
         <w:rFonts w:ascii="OpenSymbol" w:hAnsi="OpenSymbol" w:cs="OpenSymbol" w:hint="default"/>
@@ -2240,12 +2277,12 @@
       <w:start w:val="1"/>
       <w:numFmt w:val="bullet"/>
       <w:lvlText w:val=""/>
-      <w:lvlJc w:val="start"/>
+      <w:lvlJc w:val="left"/>
       <w:pPr>
         <w:tabs>
           <w:tab w:val="num" w:pos="1800"/>
         </w:tabs>
-        <w:ind w:start="1800" w:hanging="360"/>
+        <w:ind w:left="1800" w:hanging="360"/>
       </w:pPr>
       <w:rPr>
         <w:rFonts w:ascii="Symbol" w:hAnsi="Symbol" w:cs="Symbol" w:hint="default"/>
@@ -2255,12 +2292,12 @@
       <w:start w:val="1"/>
       <w:numFmt w:val="bullet"/>
       <w:lvlText w:val="◦"/>
-      <w:lvlJc w:val="start"/>
+      <w:lvlJc w:val="left"/>
       <w:pPr>
         <w:tabs>
           <w:tab w:val="num" w:pos="2160"/>
         </w:tabs>
-        <w:ind w:start="2160" w:hanging="360"/>
+        <w:ind w:left="2160" w:hanging="360"/>
       </w:pPr>
       <w:rPr>
         <w:rFonts w:ascii="OpenSymbol" w:hAnsi="OpenSymbol" w:cs="OpenSymbol" w:hint="default"/>
@@ -2270,12 +2307,12 @@
       <w:start w:val="1"/>
       <w:numFmt w:val="bullet"/>
       <w:lvlText w:val="▪"/>
-      <w:lvlJc w:val="start"/>
+      <w:lvlJc w:val="left"/>
       <w:pPr>
         <w:tabs>
           <w:tab w:val="num" w:pos="2520"/>
         </w:tabs>
-        <w:ind w:start="2520" w:hanging="360"/>
+        <w:ind w:left="2520" w:hanging="360"/>
       </w:pPr>
       <w:rPr>
         <w:rFonts w:ascii="OpenSymbol" w:hAnsi="OpenSymbol" w:cs="OpenSymbol" w:hint="default"/>
@@ -2285,12 +2322,12 @@
       <w:start w:val="1"/>
       <w:numFmt w:val="bullet"/>
       <w:lvlText w:val=""/>
-      <w:lvlJc w:val="start"/>
+      <w:lvlJc w:val="left"/>
       <w:pPr>
         <w:tabs>
           <w:tab w:val="num" w:pos="2880"/>
         </w:tabs>
-        <w:ind w:start="2880" w:hanging="360"/>
+        <w:ind w:left="2880" w:hanging="360"/>
       </w:pPr>
       <w:rPr>
         <w:rFonts w:ascii="Symbol" w:hAnsi="Symbol" w:cs="Symbol" w:hint="default"/>
@@ -2300,12 +2337,12 @@
       <w:start w:val="1"/>
       <w:numFmt w:val="bullet"/>
       <w:lvlText w:val="◦"/>
-      <w:lvlJc w:val="start"/>
+      <w:lvlJc w:val="left"/>
       <w:pPr>
         <w:tabs>
           <w:tab w:val="num" w:pos="3240"/>
         </w:tabs>
-        <w:ind w:start="3240" w:hanging="360"/>
+        <w:ind w:left="3240" w:hanging="360"/>
       </w:pPr>
       <w:rPr>
         <w:rFonts w:ascii="OpenSymbol" w:hAnsi="OpenSymbol" w:cs="OpenSymbol" w:hint="default"/>
@@ -2315,12 +2352,12 @@
       <w:start w:val="1"/>
       <w:numFmt w:val="bullet"/>
       <w:lvlText w:val="▪"/>
-      <w:lvlJc w:val="start"/>
+      <w:lvlJc w:val="left"/>
       <w:pPr>
         <w:tabs>
           <w:tab w:val="num" w:pos="3600"/>
         </w:tabs>
-        <w:ind w:start="3600" w:hanging="360"/>
+        <w:ind w:left="3600" w:hanging="360"/>
       </w:pPr>
       <w:rPr>
         <w:rFonts w:ascii="OpenSymbol" w:hAnsi="OpenSymbol" w:cs="OpenSymbol" w:hint="default"/>
@@ -2332,12 +2369,12 @@
       <w:start w:val="1"/>
       <w:numFmt w:val="bullet"/>
       <w:lvlText w:val=""/>
-      <w:lvlJc w:val="start"/>
+      <w:lvlJc w:val="left"/>
       <w:pPr>
         <w:tabs>
           <w:tab w:val="num" w:pos="720"/>
         </w:tabs>
-        <w:ind w:start="720" w:hanging="360"/>
+        <w:ind w:left="720" w:hanging="360"/>
       </w:pPr>
       <w:rPr>
         <w:rFonts w:ascii="Symbol" w:hAnsi="Symbol" w:cs="Symbol" w:hint="default"/>
@@ -2347,12 +2384,12 @@
       <w:start w:val="1"/>
       <w:numFmt w:val="bullet"/>
       <w:lvlText w:val="◦"/>
-      <w:lvlJc w:val="start"/>
+      <w:lvlJc w:val="left"/>
       <w:pPr>
         <w:tabs>
           <w:tab w:val="num" w:pos="1080"/>
         </w:tabs>
-        <w:ind w:start="1080" w:hanging="360"/>
+        <w:ind w:left="1080" w:hanging="360"/>
       </w:pPr>
       <w:rPr>
         <w:rFonts w:ascii="OpenSymbol" w:hAnsi="OpenSymbol" w:cs="OpenSymbol" w:hint="default"/>
@@ -2362,12 +2399,12 @@
       <w:start w:val="1"/>
       <w:numFmt w:val="bullet"/>
       <w:lvlText w:val="▪"/>
-      <w:lvlJc w:val="start"/>
+      <w:lvlJc w:val="left"/>
       <w:pPr>
         <w:tabs>
           <w:tab w:val="num" w:pos="1440"/>
         </w:tabs>
-        <w:ind w:start="1440" w:hanging="360"/>
+        <w:ind w:left="1440" w:hanging="360"/>
       </w:pPr>
       <w:rPr>
         <w:rFonts w:ascii="OpenSymbol" w:hAnsi="OpenSymbol" w:cs="OpenSymbol" w:hint="default"/>
@@ -2377,12 +2414,12 @@
       <w:start w:val="1"/>
       <w:numFmt w:val="bullet"/>
       <w:lvlText w:val=""/>
-      <w:lvlJc w:val="start"/>
+      <w:lvlJc w:val="left"/>
       <w:pPr>
         <w:tabs>
           <w:tab w:val="num" w:pos="1800"/>
         </w:tabs>
-        <w:ind w:start="1800" w:hanging="360"/>
+        <w:ind w:left="1800" w:hanging="360"/>
       </w:pPr>
       <w:rPr>
         <w:rFonts w:ascii="Symbol" w:hAnsi="Symbol" w:cs="Symbol" w:hint="default"/>
@@ -2392,12 +2429,12 @@
       <w:start w:val="1"/>
       <w:numFmt w:val="bullet"/>
       <w:lvlText w:val="◦"/>
-      <w:lvlJc w:val="start"/>
+      <w:lvlJc w:val="left"/>
       <w:pPr>
         <w:tabs>
           <w:tab w:val="num" w:pos="2160"/>
         </w:tabs>
-        <w:ind w:start="2160" w:hanging="360"/>
+        <w:ind w:left="2160" w:hanging="360"/>
       </w:pPr>
       <w:rPr>
         <w:rFonts w:ascii="OpenSymbol" w:hAnsi="OpenSymbol" w:cs="OpenSymbol" w:hint="default"/>
@@ -2407,12 +2444,12 @@
       <w:start w:val="1"/>
       <w:numFmt w:val="bullet"/>
       <w:lvlText w:val="▪"/>
-      <w:lvlJc w:val="start"/>
+      <w:lvlJc w:val="left"/>
       <w:pPr>
         <w:tabs>
           <w:tab w:val="num" w:pos="2520"/>
         </w:tabs>
-        <w:ind w:start="2520" w:hanging="360"/>
+        <w:ind w:left="2520" w:hanging="360"/>
       </w:pPr>
       <w:rPr>
         <w:rFonts w:ascii="OpenSymbol" w:hAnsi="OpenSymbol" w:cs="OpenSymbol" w:hint="default"/>
@@ -2422,12 +2459,12 @@
       <w:start w:val="1"/>
       <w:numFmt w:val="bullet"/>
       <w:lvlText w:val=""/>
-      <w:lvlJc w:val="start"/>
+      <w:lvlJc w:val="left"/>
       <w:pPr>
         <w:tabs>
           <w:tab w:val="num" w:pos="2880"/>
         </w:tabs>
-        <w:ind w:start="2880" w:hanging="360"/>
+        <w:ind w:left="2880" w:hanging="360"/>
       </w:pPr>
       <w:rPr>
         <w:rFonts w:ascii="Symbol" w:hAnsi="Symbol" w:cs="Symbol" w:hint="default"/>
@@ -2437,12 +2474,12 @@
       <w:start w:val="1"/>
       <w:numFmt w:val="bullet"/>
       <w:lvlText w:val="◦"/>
-      <w:lvlJc w:val="start"/>
+      <w:lvlJc w:val="left"/>
       <w:pPr>
         <w:tabs>
           <w:tab w:val="num" w:pos="3240"/>
         </w:tabs>
-        <w:ind w:start="3240" w:hanging="360"/>
+        <w:ind w:left="3240" w:hanging="360"/>
       </w:pPr>
       <w:rPr>
         <w:rFonts w:ascii="OpenSymbol" w:hAnsi="OpenSymbol" w:cs="OpenSymbol" w:hint="default"/>
@@ -2452,12 +2489,12 @@
       <w:start w:val="1"/>
       <w:numFmt w:val="bullet"/>
       <w:lvlText w:val="▪"/>
-      <w:lvlJc w:val="start"/>
+      <w:lvlJc w:val="left"/>
       <w:pPr>
         <w:tabs>
           <w:tab w:val="num" w:pos="3600"/>
         </w:tabs>
-        <w:ind w:start="3600" w:hanging="360"/>
+        <w:ind w:left="3600" w:hanging="360"/>
       </w:pPr>
       <w:rPr>
         <w:rFonts w:ascii="OpenSymbol" w:hAnsi="OpenSymbol" w:cs="OpenSymbol" w:hint="default"/>
@@ -2467,15 +2504,152 @@
   <w:abstractNum w:abstractNumId="12">
     <w:lvl w:ilvl="0">
       <w:start w:val="1"/>
+      <w:numFmt w:val="bullet"/>
+      <w:lvlText w:val=""/>
+      <w:lvlJc w:val="left"/>
+      <w:pPr>
+        <w:tabs>
+          <w:tab w:val="num" w:pos="720"/>
+        </w:tabs>
+        <w:ind w:left="720" w:hanging="360"/>
+      </w:pPr>
+      <w:rPr>
+        <w:rFonts w:ascii="Symbol" w:hAnsi="Symbol" w:cs="Symbol" w:hint="default"/>
+      </w:rPr>
+    </w:lvl>
+    <w:lvl w:ilvl="1">
+      <w:start w:val="1"/>
+      <w:numFmt w:val="bullet"/>
+      <w:lvlText w:val=""/>
+      <w:lvlJc w:val="left"/>
+      <w:pPr>
+        <w:tabs>
+          <w:tab w:val="num" w:pos="1080"/>
+        </w:tabs>
+        <w:ind w:left="1080" w:hanging="360"/>
+      </w:pPr>
+      <w:rPr>
+        <w:rFonts w:ascii="Symbol" w:hAnsi="Symbol" w:cs="Symbol" w:hint="default"/>
+      </w:rPr>
+    </w:lvl>
+    <w:lvl w:ilvl="2">
+      <w:start w:val="1"/>
+      <w:numFmt w:val="bullet"/>
+      <w:lvlText w:val=""/>
+      <w:lvlJc w:val="left"/>
+      <w:pPr>
+        <w:tabs>
+          <w:tab w:val="num" w:pos="1440"/>
+        </w:tabs>
+        <w:ind w:left="1440" w:hanging="360"/>
+      </w:pPr>
+      <w:rPr>
+        <w:rFonts w:ascii="Symbol" w:hAnsi="Symbol" w:cs="Symbol" w:hint="default"/>
+      </w:rPr>
+    </w:lvl>
+    <w:lvl w:ilvl="3">
+      <w:start w:val="1"/>
+      <w:numFmt w:val="bullet"/>
+      <w:lvlText w:val=""/>
+      <w:lvlJc w:val="left"/>
+      <w:pPr>
+        <w:tabs>
+          <w:tab w:val="num" w:pos="1800"/>
+        </w:tabs>
+        <w:ind w:left="1800" w:hanging="360"/>
+      </w:pPr>
+      <w:rPr>
+        <w:rFonts w:ascii="Symbol" w:hAnsi="Symbol" w:cs="Symbol" w:hint="default"/>
+      </w:rPr>
+    </w:lvl>
+    <w:lvl w:ilvl="4">
+      <w:start w:val="1"/>
+      <w:numFmt w:val="bullet"/>
+      <w:lvlText w:val=""/>
+      <w:lvlJc w:val="left"/>
+      <w:pPr>
+        <w:tabs>
+          <w:tab w:val="num" w:pos="2160"/>
+        </w:tabs>
+        <w:ind w:left="2160" w:hanging="360"/>
+      </w:pPr>
+      <w:rPr>
+        <w:rFonts w:ascii="Symbol" w:hAnsi="Symbol" w:cs="Symbol" w:hint="default"/>
+      </w:rPr>
+    </w:lvl>
+    <w:lvl w:ilvl="5">
+      <w:start w:val="1"/>
+      <w:numFmt w:val="bullet"/>
+      <w:lvlText w:val=""/>
+      <w:lvlJc w:val="left"/>
+      <w:pPr>
+        <w:tabs>
+          <w:tab w:val="num" w:pos="2520"/>
+        </w:tabs>
+        <w:ind w:left="2520" w:hanging="360"/>
+      </w:pPr>
+      <w:rPr>
+        <w:rFonts w:ascii="Symbol" w:hAnsi="Symbol" w:cs="Symbol" w:hint="default"/>
+      </w:rPr>
+    </w:lvl>
+    <w:lvl w:ilvl="6">
+      <w:start w:val="1"/>
+      <w:numFmt w:val="bullet"/>
+      <w:lvlText w:val=""/>
+      <w:lvlJc w:val="left"/>
+      <w:pPr>
+        <w:tabs>
+          <w:tab w:val="num" w:pos="2880"/>
+        </w:tabs>
+        <w:ind w:left="2880" w:hanging="360"/>
+      </w:pPr>
+      <w:rPr>
+        <w:rFonts w:ascii="Symbol" w:hAnsi="Symbol" w:cs="Symbol" w:hint="default"/>
+      </w:rPr>
+    </w:lvl>
+    <w:lvl w:ilvl="7">
+      <w:start w:val="1"/>
+      <w:numFmt w:val="bullet"/>
+      <w:lvlText w:val=""/>
+      <w:lvlJc w:val="left"/>
+      <w:pPr>
+        <w:tabs>
+          <w:tab w:val="num" w:pos="3240"/>
+        </w:tabs>
+        <w:ind w:left="3240" w:hanging="360"/>
+      </w:pPr>
+      <w:rPr>
+        <w:rFonts w:ascii="Symbol" w:hAnsi="Symbol" w:cs="Symbol" w:hint="default"/>
+      </w:rPr>
+    </w:lvl>
+    <w:lvl w:ilvl="8">
+      <w:start w:val="1"/>
+      <w:numFmt w:val="bullet"/>
+      <w:lvlText w:val=""/>
+      <w:lvlJc w:val="left"/>
+      <w:pPr>
+        <w:tabs>
+          <w:tab w:val="num" w:pos="3600"/>
+        </w:tabs>
+        <w:ind w:left="3600" w:hanging="360"/>
+      </w:pPr>
+      <w:rPr>
+        <w:rFonts w:ascii="Symbol" w:hAnsi="Symbol" w:cs="Symbol" w:hint="default"/>
+      </w:rPr>
+    </w:lvl>
+  </w:abstractNum>
+  <w:abstractNum w:abstractNumId="13">
+    <w:lvl w:ilvl="0">
+      <w:start w:val="1"/>
       <w:numFmt w:val="none"/>
       <w:suff w:val="nothing"/>
       <w:lvlText w:val=""/>
-      <w:lvlJc w:val="start"/>
+      <w:lvlJc w:val="left"/>
       <w:pPr>
         <w:tabs>
           <w:tab w:val="num" w:pos="0"/>
         </w:tabs>
-        <w:ind w:start="0" w:hanging="0"/>
+        <w:ind w:left="0" w:hanging="0"/>
       </w:pPr>
     </w:lvl>
     <w:lvl w:ilvl="1">
@@ -2483,12 +2657,12 @@
       <w:numFmt w:val="none"/>
       <w:suff w:val="nothing"/>
       <w:lvlText w:val=""/>
-      <w:lvlJc w:val="start"/>
+      <w:lvlJc w:val="left"/>
       <w:pPr>
         <w:tabs>
           <w:tab w:val="num" w:pos="0"/>
         </w:tabs>
-        <w:ind w:start="0" w:hanging="0"/>
+        <w:ind w:left="0" w:hanging="0"/>
       </w:pPr>
     </w:lvl>
     <w:lvl w:ilvl="2">
@@ -2496,12 +2670,12 @@
       <w:numFmt w:val="none"/>
       <w:suff w:val="nothing"/>
       <w:lvlText w:val=""/>
-      <w:lvlJc w:val="start"/>
+      <w:lvlJc w:val="left"/>
       <w:pPr>
         <w:tabs>
           <w:tab w:val="num" w:pos="0"/>
         </w:tabs>
-        <w:ind w:start="0" w:hanging="0"/>
+        <w:ind w:left="0" w:hanging="0"/>
       </w:pPr>
     </w:lvl>
     <w:lvl w:ilvl="3">
@@ -2509,12 +2683,12 @@
       <w:numFmt w:val="none"/>
       <w:suff w:val="nothing"/>
       <w:lvlText w:val=""/>
-      <w:lvlJc w:val="start"/>
+      <w:lvlJc w:val="left"/>
       <w:pPr>
         <w:tabs>
           <w:tab w:val="num" w:pos="0"/>
         </w:tabs>
-        <w:ind w:start="0" w:hanging="0"/>
+        <w:ind w:left="0" w:hanging="0"/>
       </w:pPr>
     </w:lvl>
     <w:lvl w:ilvl="4">
@@ -2522,12 +2696,12 @@
       <w:numFmt w:val="none"/>
       <w:suff w:val="nothing"/>
       <w:lvlText w:val=""/>
-      <w:lvlJc w:val="start"/>
+      <w:lvlJc w:val="left"/>
       <w:pPr>
         <w:tabs>
           <w:tab w:val="num" w:pos="0"/>
         </w:tabs>
-        <w:ind w:start="0" w:hanging="0"/>
+        <w:ind w:left="0" w:hanging="0"/>
       </w:pPr>
     </w:lvl>
     <w:lvl w:ilvl="5">
@@ -2535,12 +2709,12 @@
       <w:numFmt w:val="none"/>
       <w:suff w:val="nothing"/>
       <w:lvlText w:val=""/>
-      <w:lvlJc w:val="start"/>
+      <w:lvlJc w:val="left"/>
       <w:pPr>
         <w:tabs>
           <w:tab w:val="num" w:pos="0"/>
         </w:tabs>
-        <w:ind w:start="0" w:hanging="0"/>
+        <w:ind w:left="0" w:hanging="0"/>
       </w:pPr>
     </w:lvl>
     <w:lvl w:ilvl="6">
@@ -2548,12 +2722,12 @@
       <w:numFmt w:val="none"/>
       <w:suff w:val="nothing"/>
       <w:lvlText w:val=""/>
-      <w:lvlJc w:val="start"/>
+      <w:lvlJc w:val="left"/>
       <w:pPr>
         <w:tabs>
           <w:tab w:val="num" w:pos="0"/>
         </w:tabs>
-        <w:ind w:start="0" w:hanging="0"/>
+        <w:ind w:left="0" w:hanging="0"/>
       </w:pPr>
     </w:lvl>
     <w:lvl w:ilvl="7">
@@ -2561,12 +2735,12 @@
       <w:numFmt w:val="none"/>
       <w:suff w:val="nothing"/>
       <w:lvlText w:val=""/>
-      <w:lvlJc w:val="start"/>
+      <w:lvlJc w:val="left"/>
       <w:pPr>
         <w:tabs>
           <w:tab w:val="num" w:pos="0"/>
         </w:tabs>
-        <w:ind w:start="0" w:hanging="0"/>
+        <w:ind w:left="0" w:hanging="0"/>
       </w:pPr>
     </w:lvl>
     <w:lvl w:ilvl="8">
@@ -2574,12 +2748,12 @@
       <w:numFmt w:val="none"/>
       <w:suff w:val="nothing"/>
       <w:lvlText w:val=""/>
-      <w:lvlJc w:val="start"/>
+      <w:lvlJc w:val="left"/>
       <w:pPr>
         <w:tabs>
           <w:tab w:val="num" w:pos="0"/>
         </w:tabs>
-        <w:ind w:start="0" w:hanging="0"/>
+        <w:ind w:left="0" w:hanging="0"/>
       </w:pPr>
     </w:lvl>
   </w:abstractNum>
@@ -2619,6 +2793,9 @@
   <w:num w:numId="12">
     <w:abstractNumId w:val="12"/>
   </w:num>
+  <w:num w:numId="13">
+    <w:abstractNumId w:val="13"/>
+  </w:num>
 </w:numbering>
 </file>
 
@@ -2636,7 +2813,6 @@
     </w:rPrDefault>
     <w:pPrDefault>
       <w:pPr>
-        <w:widowControl/>
         <w:suppressAutoHyphens w:val="true"/>
       </w:pPr>
     </w:pPrDefault>
@@ -2646,7 +2822,10 @@
     <w:qFormat/>
     <w:pPr>
       <w:widowControl/>
+      <w:suppressAutoHyphens w:val="true"/>
       <w:bidi w:val="0"/>
+      <w:spacing w:before="0" w:after="0"/>
+      <w:jc w:val="left"/>
     </w:pPr>
     <w:rPr>
       <w:rFonts w:ascii="Liberation Serif" w:hAnsi="Liberation Serif" w:eastAsia="Noto Serif CJK SC" w:cs="FreeSans"/>
@@ -2664,8 +2843,15 @@
       <w:rFonts w:ascii="OpenSymbol" w:hAnsi="OpenSymbol" w:eastAsia="OpenSymbol" w:cs="OpenSymbol"/>
     </w:rPr>
   </w:style>
-  <w:style w:type="paragraph" w:styleId="Cmsor">
-    <w:name w:val="Címsor"/>
+  <w:style w:type="character" w:styleId="Bullets">
+    <w:name w:val="Bullets"/>
+    <w:qFormat/>
+    <w:rPr>
+      <w:rFonts w:ascii="Liberation Serif" w:hAnsi="Liberation Serif" w:eastAsia="OpenSymbol" w:cs="OpenSymbol"/>
+    </w:rPr>
+  </w:style>
+  <w:style w:type="paragraph" w:styleId="Heading">
+    <w:name w:val="Heading"/>
     <w:basedOn w:val="Normal"/>
     <w:next w:val="BodyText"/>
     <w:qFormat/>
@@ -2674,7 +2860,7 @@
       <w:spacing w:before="240" w:after="120"/>
     </w:pPr>
     <w:rPr>
-      <w:rFonts w:ascii="Liberation Sans" w:hAnsi="Liberation Sans" w:eastAsia="Noto Sans CJK SC" w:cs="FreeSans"/>
+      <w:rFonts w:ascii="Liberation Sans" w:hAnsi="Liberation Sans" w:eastAsia="Noto Sans CJK SC" w:cs="Noto Sans Devanagari"/>
       <w:sz w:val="28"/>
       <w:szCs w:val="28"/>
     </w:rPr>
@@ -2709,6 +2895,32 @@
       <w:iCs/>
       <w:sz w:val="24"/>
       <w:szCs w:val="24"/>
+    </w:rPr>
+  </w:style>
+  <w:style w:type="paragraph" w:styleId="Index">
+    <w:name w:val="Index"/>
+    <w:basedOn w:val="Normal"/>
+    <w:qFormat/>
+    <w:pPr>
+      <w:suppressLineNumbers/>
+    </w:pPr>
+    <w:rPr>
+      <w:rFonts w:cs="Noto Sans Devanagari"/>
+    </w:rPr>
+  </w:style>
+  <w:style w:type="paragraph" w:styleId="Cmsor">
+    <w:name w:val="Címsor"/>
+    <w:basedOn w:val="Normal"/>
+    <w:next w:val="BodyText"/>
+    <w:qFormat/>
+    <w:pPr>
+      <w:keepNext w:val="true"/>
+      <w:spacing w:before="240" w:after="120"/>
+    </w:pPr>
+    <w:rPr>
+      <w:rFonts w:ascii="Liberation Sans" w:hAnsi="Liberation Sans" w:eastAsia="Noto Sans CJK SC" w:cs="FreeSans"/>
+      <w:sz w:val="28"/>
+      <w:szCs w:val="28"/>
     </w:rPr>
   </w:style>
   <w:style w:type="paragraph" w:styleId="Trgymutat">

</xml_diff>